<commit_message>
Publish workspace from pulse-cluster @ 07c3b40
Page built with --flat so pdf/ and the Markdown sources resolve from the
site root. Assets refreshed alongside it.
</commit_message>
<xml_diff>
--- a/pdf/PULSE-SAF-001_Safety_Concept.docx
+++ b/pdf/PULSE-SAF-001_Safety_Concept.docx
@@ -108,34 +108,32 @@
         </w:p>
       </w:sdtContent>
     </w:sdt>
+    <w:bookmarkStart w:id="21" w:name="document-control"/>
     <w:p>
       <w:pPr>
         <w:pStyle w:val="Heading1"/>
       </w:pPr>
-      <w:bookmarkStart w:id="20" w:name="document-control"/>
       <w:r>
         <w:t xml:space="preserve">Document control</w:t>
       </w:r>
-      <w:bookmarkEnd w:id="20"/>
     </w:p>
     <w:tbl>
       <w:tblPr>
         <w:tblStyle w:val="Table"/>
-        <w:tblW w:type="pct" w:w="0.0"/>
-        <w:tblLook w:firstRow="1"/>
+        <w:tblW w:type="pct" w:w="5000"/>
+        <w:tblLook w:firstRow="1" w:lastRow="0" w:firstColumn="0" w:lastColumn="0" w:noHBand="0" w:noVBand="0" w:val="0020"/>
+        <w:jc w:val="start"/>
       </w:tblPr>
-      <w:tblGrid/>
+      <w:tblGrid>
+        <w:gridCol w:w="1980"/>
+        <w:gridCol w:w="5940"/>
+      </w:tblGrid>
       <w:tr>
         <w:trPr>
-          <w:cnfStyle w:firstRow="1"/>
+          <w:tblHeader w:val="true"/>
         </w:trPr>
         <w:tc>
-          <w:tcPr>
-            <w:tcBorders>
-              <w:bottom w:val="single"/>
-            </w:tcBorders>
-            <w:vAlign w:val="bottom"/>
-          </w:tcPr>
+          <w:tcPr/>
           <w:p>
             <w:pPr>
               <w:pStyle w:val="Compact"/>
@@ -147,12 +145,7 @@
           </w:p>
         </w:tc>
         <w:tc>
-          <w:tcPr>
-            <w:tcBorders>
-              <w:bottom w:val="single"/>
-            </w:tcBorders>
-            <w:vAlign w:val="bottom"/>
-          </w:tcPr>
+          <w:tcPr/>
           <w:p>
             <w:pPr>
               <w:pStyle w:val="Compact"/>
@@ -166,6 +159,7 @@
       </w:tr>
       <w:tr>
         <w:tc>
+          <w:tcPr/>
           <w:p>
             <w:pPr>
               <w:pStyle w:val="Compact"/>
@@ -177,6 +171,7 @@
           </w:p>
         </w:tc>
         <w:tc>
+          <w:tcPr/>
           <w:p>
             <w:pPr>
               <w:pStyle w:val="Compact"/>
@@ -190,6 +185,7 @@
       </w:tr>
       <w:tr>
         <w:tc>
+          <w:tcPr/>
           <w:p>
             <w:pPr>
               <w:pStyle w:val="Compact"/>
@@ -201,6 +197,7 @@
           </w:p>
         </w:tc>
         <w:tc>
+          <w:tcPr/>
           <w:p>
             <w:pPr>
               <w:pStyle w:val="Compact"/>
@@ -214,6 +211,7 @@
       </w:tr>
       <w:tr>
         <w:tc>
+          <w:tcPr/>
           <w:p>
             <w:pPr>
               <w:pStyle w:val="Compact"/>
@@ -225,19 +223,21 @@
           </w:p>
         </w:tc>
         <w:tc>
-          <w:p>
-            <w:pPr>
-              <w:pStyle w:val="Compact"/>
-              <w:jc w:val="left"/>
-            </w:pPr>
-            <w:r>
-              <w:t xml:space="preserve">0.9.4</w:t>
-            </w:r>
-          </w:p>
-        </w:tc>
-      </w:tr>
-      <w:tr>
-        <w:tc>
+          <w:tcPr/>
+          <w:p>
+            <w:pPr>
+              <w:pStyle w:val="Compact"/>
+              <w:jc w:val="left"/>
+            </w:pPr>
+            <w:r>
+              <w:t xml:space="preserve">0.9.5</w:t>
+            </w:r>
+          </w:p>
+        </w:tc>
+      </w:tr>
+      <w:tr>
+        <w:tc>
+          <w:tcPr/>
           <w:p>
             <w:pPr>
               <w:pStyle w:val="Compact"/>
@@ -249,6 +249,7 @@
           </w:p>
         </w:tc>
         <w:tc>
+          <w:tcPr/>
           <w:p>
             <w:pPr>
               <w:pStyle w:val="Compact"/>
@@ -262,6 +263,7 @@
       </w:tr>
       <w:tr>
         <w:tc>
+          <w:tcPr/>
           <w:p>
             <w:pPr>
               <w:pStyle w:val="Compact"/>
@@ -273,19 +275,21 @@
           </w:p>
         </w:tc>
         <w:tc>
-          <w:p>
-            <w:pPr>
-              <w:pStyle w:val="Compact"/>
-              <w:jc w:val="left"/>
-            </w:pPr>
-            <w:r>
-              <w:t xml:space="preserve">2026-09-23</w:t>
-            </w:r>
-          </w:p>
-        </w:tc>
-      </w:tr>
-      <w:tr>
-        <w:tc>
+          <w:tcPr/>
+          <w:p>
+            <w:pPr>
+              <w:pStyle w:val="Compact"/>
+              <w:jc w:val="left"/>
+            </w:pPr>
+            <w:r>
+              <w:t xml:space="preserve">2026-10-02</w:t>
+            </w:r>
+          </w:p>
+        </w:tc>
+      </w:tr>
+      <w:tr>
+        <w:tc>
+          <w:tcPr/>
           <w:p>
             <w:pPr>
               <w:pStyle w:val="Compact"/>
@@ -297,6 +301,7 @@
           </w:p>
         </w:tc>
         <w:tc>
+          <w:tcPr/>
           <w:p>
             <w:pPr>
               <w:pStyle w:val="Compact"/>
@@ -310,6 +315,7 @@
       </w:tr>
       <w:tr>
         <w:tc>
+          <w:tcPr/>
           <w:p>
             <w:pPr>
               <w:pStyle w:val="Compact"/>
@@ -321,6 +327,7 @@
           </w:p>
         </w:tc>
         <w:tc>
+          <w:tcPr/>
           <w:p>
             <w:pPr>
               <w:pStyle w:val="Compact"/>
@@ -334,6 +341,7 @@
       </w:tr>
       <w:tr>
         <w:tc>
+          <w:tcPr/>
           <w:p>
             <w:pPr>
               <w:pStyle w:val="Compact"/>
@@ -345,6 +353,7 @@
           </w:p>
         </w:tc>
         <w:tc>
+          <w:tcPr/>
           <w:p>
             <w:pPr>
               <w:pStyle w:val="Compact"/>
@@ -358,6 +367,7 @@
       </w:tr>
       <w:tr>
         <w:tc>
+          <w:tcPr/>
           <w:p>
             <w:pPr>
               <w:pStyle w:val="Compact"/>
@@ -369,6 +379,7 @@
           </w:p>
         </w:tc>
         <w:tc>
+          <w:tcPr/>
           <w:p>
             <w:pPr>
               <w:pStyle w:val="Compact"/>
@@ -382,6 +393,7 @@
       </w:tr>
       <w:tr>
         <w:tc>
+          <w:tcPr/>
           <w:p>
             <w:pPr>
               <w:pStyle w:val="Compact"/>
@@ -393,6 +405,7 @@
           </w:p>
         </w:tc>
         <w:tc>
+          <w:tcPr/>
           <w:p>
             <w:pPr>
               <w:pStyle w:val="Compact"/>
@@ -405,21 +418,21 @@
         </w:tc>
       </w:tr>
     </w:tbl>
+    <w:bookmarkStart w:id="20" w:name="change-log"/>
     <w:p>
       <w:pPr>
         <w:pStyle w:val="Heading2"/>
       </w:pPr>
-      <w:bookmarkStart w:id="21" w:name="change-log"/>
       <w:r>
         <w:t xml:space="preserve">Change log</w:t>
       </w:r>
-      <w:bookmarkEnd w:id="21"/>
     </w:p>
     <w:tbl>
       <w:tblPr>
         <w:tblStyle w:val="Table"/>
-        <w:tblW w:type="pct" w:w="5000.0"/>
-        <w:tblLook w:firstRow="1"/>
+        <w:tblW w:type="pct" w:w="5000"/>
+        <w:tblLook w:firstRow="1" w:lastRow="0" w:firstColumn="0" w:lastColumn="0" w:noHBand="0" w:noVBand="0" w:val="0020"/>
+        <w:jc w:val="start"/>
       </w:tblPr>
       <w:tblGrid>
         <w:gridCol w:w="633"/>
@@ -429,15 +442,10 @@
       </w:tblGrid>
       <w:tr>
         <w:trPr>
-          <w:cnfStyle w:firstRow="1"/>
+          <w:tblHeader w:val="true"/>
         </w:trPr>
         <w:tc>
-          <w:tcPr>
-            <w:tcBorders>
-              <w:bottom w:val="single"/>
-            </w:tcBorders>
-            <w:vAlign w:val="bottom"/>
-          </w:tcPr>
+          <w:tcPr/>
           <w:p>
             <w:pPr>
               <w:pStyle w:val="Compact"/>
@@ -449,12 +457,7 @@
           </w:p>
         </w:tc>
         <w:tc>
-          <w:tcPr>
-            <w:tcBorders>
-              <w:bottom w:val="single"/>
-            </w:tcBorders>
-            <w:vAlign w:val="bottom"/>
-          </w:tcPr>
+          <w:tcPr/>
           <w:p>
             <w:pPr>
               <w:pStyle w:val="Compact"/>
@@ -466,12 +469,7 @@
           </w:p>
         </w:tc>
         <w:tc>
-          <w:tcPr>
-            <w:tcBorders>
-              <w:bottom w:val="single"/>
-            </w:tcBorders>
-            <w:vAlign w:val="bottom"/>
-          </w:tcPr>
+          <w:tcPr/>
           <w:p>
             <w:pPr>
               <w:pStyle w:val="Compact"/>
@@ -483,12 +481,7 @@
           </w:p>
         </w:tc>
         <w:tc>
-          <w:tcPr>
-            <w:tcBorders>
-              <w:bottom w:val="single"/>
-            </w:tcBorders>
-            <w:vAlign w:val="bottom"/>
-          </w:tcPr>
+          <w:tcPr/>
           <w:p>
             <w:pPr>
               <w:pStyle w:val="Compact"/>
@@ -502,6 +495,7 @@
       </w:tr>
       <w:tr>
         <w:tc>
+          <w:tcPr/>
           <w:p>
             <w:pPr>
               <w:pStyle w:val="Compact"/>
@@ -513,6 +507,7 @@
           </w:p>
         </w:tc>
         <w:tc>
+          <w:tcPr/>
           <w:p>
             <w:pPr>
               <w:pStyle w:val="Compact"/>
@@ -524,6 +519,7 @@
           </w:p>
         </w:tc>
         <w:tc>
+          <w:tcPr/>
           <w:p>
             <w:pPr>
               <w:pStyle w:val="Compact"/>
@@ -535,6 +531,7 @@
           </w:p>
         </w:tc>
         <w:tc>
+          <w:tcPr/>
           <w:p>
             <w:pPr>
               <w:pStyle w:val="Compact"/>
@@ -548,6 +545,7 @@
       </w:tr>
       <w:tr>
         <w:tc>
+          <w:tcPr/>
           <w:p>
             <w:pPr>
               <w:pStyle w:val="Compact"/>
@@ -559,6 +557,7 @@
           </w:p>
         </w:tc>
         <w:tc>
+          <w:tcPr/>
           <w:p>
             <w:pPr>
               <w:pStyle w:val="Compact"/>
@@ -570,6 +569,7 @@
           </w:p>
         </w:tc>
         <w:tc>
+          <w:tcPr/>
           <w:p>
             <w:pPr>
               <w:pStyle w:val="Compact"/>
@@ -581,6 +581,7 @@
           </w:p>
         </w:tc>
         <w:tc>
+          <w:tcPr/>
           <w:p>
             <w:pPr>
               <w:pStyle w:val="Compact"/>
@@ -594,6 +595,7 @@
       </w:tr>
       <w:tr>
         <w:tc>
+          <w:tcPr/>
           <w:p>
             <w:pPr>
               <w:pStyle w:val="Compact"/>
@@ -605,6 +607,7 @@
           </w:p>
         </w:tc>
         <w:tc>
+          <w:tcPr/>
           <w:p>
             <w:pPr>
               <w:pStyle w:val="Compact"/>
@@ -616,6 +619,7 @@
           </w:p>
         </w:tc>
         <w:tc>
+          <w:tcPr/>
           <w:p>
             <w:pPr>
               <w:pStyle w:val="Compact"/>
@@ -627,6 +631,7 @@
           </w:p>
         </w:tc>
         <w:tc>
+          <w:tcPr/>
           <w:p>
             <w:pPr>
               <w:pStyle w:val="Compact"/>
@@ -640,6 +645,7 @@
       </w:tr>
       <w:tr>
         <w:tc>
+          <w:tcPr/>
           <w:p>
             <w:pPr>
               <w:pStyle w:val="Compact"/>
@@ -651,6 +657,7 @@
           </w:p>
         </w:tc>
         <w:tc>
+          <w:tcPr/>
           <w:p>
             <w:pPr>
               <w:pStyle w:val="Compact"/>
@@ -662,6 +669,7 @@
           </w:p>
         </w:tc>
         <w:tc>
+          <w:tcPr/>
           <w:p>
             <w:pPr>
               <w:pStyle w:val="Compact"/>
@@ -673,6 +681,7 @@
           </w:p>
         </w:tc>
         <w:tc>
+          <w:tcPr/>
           <w:p>
             <w:pPr>
               <w:pStyle w:val="Compact"/>
@@ -686,6 +695,7 @@
       </w:tr>
       <w:tr>
         <w:tc>
+          <w:tcPr/>
           <w:p>
             <w:pPr>
               <w:pStyle w:val="Compact"/>
@@ -697,6 +707,7 @@
           </w:p>
         </w:tc>
         <w:tc>
+          <w:tcPr/>
           <w:p>
             <w:pPr>
               <w:pStyle w:val="Compact"/>
@@ -708,6 +719,7 @@
           </w:p>
         </w:tc>
         <w:tc>
+          <w:tcPr/>
           <w:p>
             <w:pPr>
               <w:pStyle w:val="Compact"/>
@@ -719,6 +731,7 @@
           </w:p>
         </w:tc>
         <w:tc>
+          <w:tcPr/>
           <w:p>
             <w:pPr>
               <w:pStyle w:val="Compact"/>
@@ -730,16 +743,67 @@
           </w:p>
         </w:tc>
       </w:tr>
+      <w:tr>
+        <w:tc>
+          <w:tcPr/>
+          <w:p>
+            <w:pPr>
+              <w:pStyle w:val="Compact"/>
+              <w:jc w:val="left"/>
+            </w:pPr>
+            <w:r>
+              <w:t xml:space="preserve">0.9.5</w:t>
+            </w:r>
+          </w:p>
+        </w:tc>
+        <w:tc>
+          <w:tcPr/>
+          <w:p>
+            <w:pPr>
+              <w:pStyle w:val="Compact"/>
+              <w:jc w:val="left"/>
+            </w:pPr>
+            <w:r>
+              <w:t xml:space="preserve">2026-10-02</w:t>
+            </w:r>
+          </w:p>
+        </w:tc>
+        <w:tc>
+          <w:tcPr/>
+          <w:p>
+            <w:pPr>
+              <w:pStyle w:val="Compact"/>
+              <w:jc w:val="left"/>
+            </w:pPr>
+            <w:r>
+              <w:t xml:space="preserve">A. Abdelghany</w:t>
+            </w:r>
+          </w:p>
+        </w:tc>
+        <w:tc>
+          <w:tcPr/>
+          <w:p>
+            <w:pPr>
+              <w:pStyle w:val="Compact"/>
+              <w:jc w:val="left"/>
+            </w:pPr>
+            <w:r>
+              <w:t xml:space="preserve">SR-4 and SR-5 verified on the Compose cluster on a device: all eight freshness criteria, instrumented smoke test, captures of the degraded and recovered display</w:t>
+            </w:r>
+          </w:p>
+        </w:tc>
+      </w:tr>
     </w:tbl>
+    <w:bookmarkEnd w:id="20"/>
+    <w:bookmarkEnd w:id="21"/>
+    <w:bookmarkStart w:id="22" w:name="purpose-and-disclaimer"/>
     <w:p>
       <w:pPr>
         <w:pStyle w:val="Heading1"/>
       </w:pPr>
-      <w:bookmarkStart w:id="22" w:name="purpose-and-disclaimer"/>
       <w:r>
         <w:t xml:space="preserve">1. Purpose and disclaimer</w:t>
       </w:r>
-      <w:bookmarkEnd w:id="22"/>
     </w:p>
     <w:p>
       <w:pPr>
@@ -765,21 +829,22 @@
         <w:t xml:space="preserve">Abbreviations used here are defined in the glossary, PULSE-StRS-001 section 8.</w:t>
       </w:r>
     </w:p>
+    <w:bookmarkEnd w:id="22"/>
+    <w:bookmarkStart w:id="23" w:name="item-definition-sr-1"/>
     <w:p>
       <w:pPr>
         <w:pStyle w:val="Heading1"/>
       </w:pPr>
-      <w:bookmarkStart w:id="23" w:name="item-definition-sr-1"/>
       <w:r>
         <w:t xml:space="preserve">2. Item definition (SR-1)</w:t>
       </w:r>
-      <w:bookmarkEnd w:id="23"/>
     </w:p>
     <w:tbl>
       <w:tblPr>
         <w:tblStyle w:val="Table"/>
-        <w:tblW w:type="pct" w:w="5000.0"/>
-        <w:tblLook w:firstRow="1"/>
+        <w:tblW w:type="pct" w:w="5000"/>
+        <w:tblLook w:firstRow="1" w:lastRow="0" w:firstColumn="0" w:lastColumn="0" w:noHBand="0" w:noVBand="0" w:val="0020"/>
+        <w:jc w:val="start"/>
       </w:tblPr>
       <w:tblGrid>
         <w:gridCol w:w="1742"/>
@@ -787,15 +852,10 @@
       </w:tblGrid>
       <w:tr>
         <w:trPr>
-          <w:cnfStyle w:firstRow="1"/>
+          <w:tblHeader w:val="true"/>
         </w:trPr>
         <w:tc>
-          <w:tcPr>
-            <w:tcBorders>
-              <w:bottom w:val="single"/>
-            </w:tcBorders>
-            <w:vAlign w:val="bottom"/>
-          </w:tcPr>
+          <w:tcPr/>
           <w:p>
             <w:pPr>
               <w:pStyle w:val="Compact"/>
@@ -807,12 +867,7 @@
           </w:p>
         </w:tc>
         <w:tc>
-          <w:tcPr>
-            <w:tcBorders>
-              <w:bottom w:val="single"/>
-            </w:tcBorders>
-            <w:vAlign w:val="bottom"/>
-          </w:tcPr>
+          <w:tcPr/>
           <w:p>
             <w:pPr>
               <w:pStyle w:val="Compact"/>
@@ -826,6 +881,7 @@
       </w:tr>
       <w:tr>
         <w:tc>
+          <w:tcPr/>
           <w:p>
             <w:pPr>
               <w:pStyle w:val="Compact"/>
@@ -837,6 +893,7 @@
           </w:p>
         </w:tc>
         <w:tc>
+          <w:tcPr/>
           <w:p>
             <w:pPr>
               <w:pStyle w:val="Compact"/>
@@ -850,6 +907,7 @@
       </w:tr>
       <w:tr>
         <w:tc>
+          <w:tcPr/>
           <w:p>
             <w:pPr>
               <w:pStyle w:val="Compact"/>
@@ -861,6 +919,7 @@
           </w:p>
         </w:tc>
         <w:tc>
+          <w:tcPr/>
           <w:p>
             <w:pPr>
               <w:pStyle w:val="Compact"/>
@@ -874,6 +933,7 @@
       </w:tr>
       <w:tr>
         <w:tc>
+          <w:tcPr/>
           <w:p>
             <w:pPr>
               <w:pStyle w:val="Compact"/>
@@ -885,6 +945,7 @@
           </w:p>
         </w:tc>
         <w:tc>
+          <w:tcPr/>
           <w:p>
             <w:pPr>
               <w:pStyle w:val="Compact"/>
@@ -898,6 +959,7 @@
       </w:tr>
       <w:tr>
         <w:tc>
+          <w:tcPr/>
           <w:p>
             <w:pPr>
               <w:pStyle w:val="Compact"/>
@@ -909,6 +971,7 @@
           </w:p>
         </w:tc>
         <w:tc>
+          <w:tcPr/>
           <w:p>
             <w:pPr>
               <w:pStyle w:val="Compact"/>
@@ -922,6 +985,7 @@
       </w:tr>
       <w:tr>
         <w:tc>
+          <w:tcPr/>
           <w:p>
             <w:pPr>
               <w:pStyle w:val="Compact"/>
@@ -933,6 +997,7 @@
           </w:p>
         </w:tc>
         <w:tc>
+          <w:tcPr/>
           <w:p>
             <w:pPr>
               <w:pStyle w:val="Compact"/>
@@ -946,6 +1011,7 @@
       </w:tr>
       <w:tr>
         <w:tc>
+          <w:tcPr/>
           <w:p>
             <w:pPr>
               <w:pStyle w:val="Compact"/>
@@ -957,6 +1023,7 @@
           </w:p>
         </w:tc>
         <w:tc>
+          <w:tcPr/>
           <w:p>
             <w:pPr>
               <w:pStyle w:val="Compact"/>
@@ -970,6 +1037,7 @@
       </w:tr>
       <w:tr>
         <w:tc>
+          <w:tcPr/>
           <w:p>
             <w:pPr>
               <w:pStyle w:val="Compact"/>
@@ -981,6 +1049,7 @@
           </w:p>
         </w:tc>
         <w:tc>
+          <w:tcPr/>
           <w:p>
             <w:pPr>
               <w:pStyle w:val="Compact"/>
@@ -994,6 +1063,7 @@
       </w:tr>
       <w:tr>
         <w:tc>
+          <w:tcPr/>
           <w:p>
             <w:pPr>
               <w:pStyle w:val="Compact"/>
@@ -1005,6 +1075,7 @@
           </w:p>
         </w:tc>
         <w:tc>
+          <w:tcPr/>
           <w:p>
             <w:pPr>
               <w:pStyle w:val="Compact"/>
@@ -1017,15 +1088,15 @@
         </w:tc>
       </w:tr>
     </w:tbl>
+    <w:bookmarkEnd w:id="23"/>
+    <w:bookmarkStart w:id="24" w:name="safety-relevant-signals-sr-3-sr-5"/>
     <w:p>
       <w:pPr>
         <w:pStyle w:val="Heading1"/>
       </w:pPr>
-      <w:bookmarkStart w:id="24" w:name="safety-relevant-signals-sr-3-sr-5"/>
       <w:r>
         <w:t xml:space="preserve">3. Safety-relevant signals (SR-3, SR-5)</w:t>
       </w:r>
-      <w:bookmarkEnd w:id="24"/>
     </w:p>
     <w:p>
       <w:pPr>
@@ -1038,8 +1109,9 @@
     <w:tbl>
       <w:tblPr>
         <w:tblStyle w:val="Table"/>
-        <w:tblW w:type="pct" w:w="5000.0"/>
-        <w:tblLook w:firstRow="1"/>
+        <w:tblW w:type="pct" w:w="5000"/>
+        <w:tblLook w:firstRow="1" w:lastRow="0" w:firstColumn="0" w:lastColumn="0" w:noHBand="0" w:noVBand="0" w:val="0020"/>
+        <w:jc w:val="start"/>
       </w:tblPr>
       <w:tblGrid>
         <w:gridCol w:w="2217"/>
@@ -1050,15 +1122,10 @@
       </w:tblGrid>
       <w:tr>
         <w:trPr>
-          <w:cnfStyle w:firstRow="1"/>
+          <w:tblHeader w:val="true"/>
         </w:trPr>
         <w:tc>
-          <w:tcPr>
-            <w:tcBorders>
-              <w:bottom w:val="single"/>
-            </w:tcBorders>
-            <w:vAlign w:val="bottom"/>
-          </w:tcPr>
+          <w:tcPr/>
           <w:p>
             <w:pPr>
               <w:pStyle w:val="Compact"/>
@@ -1070,12 +1137,7 @@
           </w:p>
         </w:tc>
         <w:tc>
-          <w:tcPr>
-            <w:tcBorders>
-              <w:bottom w:val="single"/>
-            </w:tcBorders>
-            <w:vAlign w:val="bottom"/>
-          </w:tcPr>
+          <w:tcPr/>
           <w:p>
             <w:pPr>
               <w:pStyle w:val="Compact"/>
@@ -1087,12 +1149,7 @@
           </w:p>
         </w:tc>
         <w:tc>
-          <w:tcPr>
-            <w:tcBorders>
-              <w:bottom w:val="single"/>
-            </w:tcBorders>
-            <w:vAlign w:val="bottom"/>
-          </w:tcPr>
+          <w:tcPr/>
           <w:p>
             <w:pPr>
               <w:pStyle w:val="Compact"/>
@@ -1104,12 +1161,7 @@
           </w:p>
         </w:tc>
         <w:tc>
-          <w:tcPr>
-            <w:tcBorders>
-              <w:bottom w:val="single"/>
-            </w:tcBorders>
-            <w:vAlign w:val="bottom"/>
-          </w:tcPr>
+          <w:tcPr/>
           <w:p>
             <w:pPr>
               <w:pStyle w:val="Compact"/>
@@ -1121,12 +1173,7 @@
           </w:p>
         </w:tc>
         <w:tc>
-          <w:tcPr>
-            <w:tcBorders>
-              <w:bottom w:val="single"/>
-            </w:tcBorders>
-            <w:vAlign w:val="bottom"/>
-          </w:tcPr>
+          <w:tcPr/>
           <w:p>
             <w:pPr>
               <w:pStyle w:val="Compact"/>
@@ -1140,6 +1187,7 @@
       </w:tr>
       <w:tr>
         <w:tc>
+          <w:tcPr/>
           <w:p>
             <w:pPr>
               <w:pStyle w:val="Compact"/>
@@ -1151,6 +1199,7 @@
           </w:p>
         </w:tc>
         <w:tc>
+          <w:tcPr/>
           <w:p>
             <w:pPr>
               <w:pStyle w:val="Compact"/>
@@ -1162,6 +1211,7 @@
           </w:p>
         </w:tc>
         <w:tc>
+          <w:tcPr/>
           <w:p>
             <w:pPr>
               <w:pStyle w:val="Compact"/>
@@ -1173,6 +1223,7 @@
           </w:p>
         </w:tc>
         <w:tc>
+          <w:tcPr/>
           <w:p>
             <w:pPr>
               <w:pStyle w:val="Compact"/>
@@ -1184,6 +1235,7 @@
           </w:p>
         </w:tc>
         <w:tc>
+          <w:tcPr/>
           <w:p>
             <w:pPr>
               <w:pStyle w:val="Compact"/>
@@ -1197,6 +1249,7 @@
       </w:tr>
       <w:tr>
         <w:tc>
+          <w:tcPr/>
           <w:p>
             <w:pPr>
               <w:pStyle w:val="Compact"/>
@@ -1208,6 +1261,7 @@
           </w:p>
         </w:tc>
         <w:tc>
+          <w:tcPr/>
           <w:p>
             <w:pPr>
               <w:pStyle w:val="Compact"/>
@@ -1219,6 +1273,7 @@
           </w:p>
         </w:tc>
         <w:tc>
+          <w:tcPr/>
           <w:p>
             <w:pPr>
               <w:pStyle w:val="Compact"/>
@@ -1230,6 +1285,7 @@
           </w:p>
         </w:tc>
         <w:tc>
+          <w:tcPr/>
           <w:p>
             <w:pPr>
               <w:pStyle w:val="Compact"/>
@@ -1241,6 +1297,7 @@
           </w:p>
         </w:tc>
         <w:tc>
+          <w:tcPr/>
           <w:p>
             <w:pPr>
               <w:pStyle w:val="Compact"/>
@@ -1266,6 +1323,7 @@
       </w:tr>
       <w:tr>
         <w:tc>
+          <w:tcPr/>
           <w:p>
             <w:pPr>
               <w:pStyle w:val="Compact"/>
@@ -1277,6 +1335,7 @@
           </w:p>
         </w:tc>
         <w:tc>
+          <w:tcPr/>
           <w:p>
             <w:pPr>
               <w:pStyle w:val="Compact"/>
@@ -1288,6 +1347,7 @@
           </w:p>
         </w:tc>
         <w:tc>
+          <w:tcPr/>
           <w:p>
             <w:pPr>
               <w:pStyle w:val="Compact"/>
@@ -1299,6 +1359,7 @@
           </w:p>
         </w:tc>
         <w:tc>
+          <w:tcPr/>
           <w:p>
             <w:pPr>
               <w:pStyle w:val="Compact"/>
@@ -1310,6 +1371,7 @@
           </w:p>
         </w:tc>
         <w:tc>
+          <w:tcPr/>
           <w:p>
             <w:pPr>
               <w:pStyle w:val="Compact"/>
@@ -1323,6 +1385,7 @@
       </w:tr>
       <w:tr>
         <w:tc>
+          <w:tcPr/>
           <w:p>
             <w:pPr>
               <w:pStyle w:val="Compact"/>
@@ -1334,6 +1397,7 @@
           </w:p>
         </w:tc>
         <w:tc>
+          <w:tcPr/>
           <w:p>
             <w:pPr>
               <w:pStyle w:val="Compact"/>
@@ -1345,6 +1409,7 @@
           </w:p>
         </w:tc>
         <w:tc>
+          <w:tcPr/>
           <w:p>
             <w:pPr>
               <w:pStyle w:val="Compact"/>
@@ -1356,6 +1421,7 @@
           </w:p>
         </w:tc>
         <w:tc>
+          <w:tcPr/>
           <w:p>
             <w:pPr>
               <w:pStyle w:val="Compact"/>
@@ -1367,6 +1433,7 @@
           </w:p>
         </w:tc>
         <w:tc>
+          <w:tcPr/>
           <w:p>
             <w:pPr>
               <w:pStyle w:val="Compact"/>
@@ -1380,6 +1447,7 @@
       </w:tr>
       <w:tr>
         <w:tc>
+          <w:tcPr/>
           <w:p>
             <w:pPr>
               <w:pStyle w:val="Compact"/>
@@ -1391,6 +1459,7 @@
           </w:p>
         </w:tc>
         <w:tc>
+          <w:tcPr/>
           <w:p>
             <w:pPr>
               <w:pStyle w:val="Compact"/>
@@ -1402,6 +1471,7 @@
           </w:p>
         </w:tc>
         <w:tc>
+          <w:tcPr/>
           <w:p>
             <w:pPr>
               <w:pStyle w:val="Compact"/>
@@ -1413,6 +1483,7 @@
           </w:p>
         </w:tc>
         <w:tc>
+          <w:tcPr/>
           <w:p>
             <w:pPr>
               <w:pStyle w:val="Compact"/>
@@ -1424,6 +1495,7 @@
           </w:p>
         </w:tc>
         <w:tc>
+          <w:tcPr/>
           <w:p>
             <w:pPr>
               <w:pStyle w:val="Compact"/>
@@ -1449,6 +1521,7 @@
       </w:tr>
       <w:tr>
         <w:tc>
+          <w:tcPr/>
           <w:p>
             <w:pPr>
               <w:pStyle w:val="Compact"/>
@@ -1460,6 +1533,7 @@
           </w:p>
         </w:tc>
         <w:tc>
+          <w:tcPr/>
           <w:p>
             <w:pPr>
               <w:pStyle w:val="Compact"/>
@@ -1471,6 +1545,7 @@
           </w:p>
         </w:tc>
         <w:tc>
+          <w:tcPr/>
           <w:p>
             <w:pPr>
               <w:pStyle w:val="Compact"/>
@@ -1482,6 +1557,7 @@
           </w:p>
         </w:tc>
         <w:tc>
+          <w:tcPr/>
           <w:p>
             <w:pPr>
               <w:pStyle w:val="Compact"/>
@@ -1493,6 +1569,7 @@
           </w:p>
         </w:tc>
         <w:tc>
+          <w:tcPr/>
           <w:p>
             <w:pPr>
               <w:pStyle w:val="Compact"/>
@@ -1506,6 +1583,7 @@
       </w:tr>
       <w:tr>
         <w:tc>
+          <w:tcPr/>
           <w:p>
             <w:pPr>
               <w:pStyle w:val="Compact"/>
@@ -1517,6 +1595,7 @@
           </w:p>
         </w:tc>
         <w:tc>
+          <w:tcPr/>
           <w:p>
             <w:pPr>
               <w:pStyle w:val="Compact"/>
@@ -1528,6 +1607,7 @@
           </w:p>
         </w:tc>
         <w:tc>
+          <w:tcPr/>
           <w:p>
             <w:pPr>
               <w:pStyle w:val="Compact"/>
@@ -1539,6 +1619,7 @@
           </w:p>
         </w:tc>
         <w:tc>
+          <w:tcPr/>
           <w:p>
             <w:pPr>
               <w:pStyle w:val="Compact"/>
@@ -1550,6 +1631,7 @@
           </w:p>
         </w:tc>
         <w:tc>
+          <w:tcPr/>
           <w:p>
             <w:pPr>
               <w:pStyle w:val="Compact"/>
@@ -1575,6 +1657,7 @@
       </w:tr>
       <w:tr>
         <w:tc>
+          <w:tcPr/>
           <w:p>
             <w:pPr>
               <w:pStyle w:val="Compact"/>
@@ -1586,6 +1669,7 @@
           </w:p>
         </w:tc>
         <w:tc>
+          <w:tcPr/>
           <w:p>
             <w:pPr>
               <w:pStyle w:val="Compact"/>
@@ -1597,6 +1681,7 @@
           </w:p>
         </w:tc>
         <w:tc>
+          <w:tcPr/>
           <w:p>
             <w:pPr>
               <w:pStyle w:val="Compact"/>
@@ -1608,6 +1693,7 @@
           </w:p>
         </w:tc>
         <w:tc>
+          <w:tcPr/>
           <w:p>
             <w:pPr>
               <w:pStyle w:val="Compact"/>
@@ -1619,6 +1705,7 @@
           </w:p>
         </w:tc>
         <w:tc>
+          <w:tcPr/>
           <w:p>
             <w:pPr>
               <w:pStyle w:val="Compact"/>
@@ -1639,15 +1726,15 @@
         <w:t xml:space="preserve">Both HMIs enforce these criteria (SM-1). Freshness is judged by when a value last arrived, on the HMI’s own monotonic clock, rather than by the broker’s timestamp: that needs no clock agreement between hosts and catches a lost broker or link as well as a stalled provider. Providers therefore republish every signal in this table on every tick even when its value is unchanged.</w:t>
       </w:r>
     </w:p>
+    <w:bookmarkEnd w:id="24"/>
+    <w:bookmarkStart w:id="25" w:name="Xf0fff9e4ea52f419666896aa5e7001351f49439"/>
     <w:p>
       <w:pPr>
         <w:pStyle w:val="Heading1"/>
       </w:pPr>
-      <w:bookmarkStart w:id="25" w:name="Xf0fff9e4ea52f419666896aa5e7001351f49439"/>
       <w:r>
         <w:t xml:space="preserve">4. Preliminary hazard analysis and risk assessment (SR-2)</w:t>
       </w:r>
-      <w:bookmarkEnd w:id="25"/>
     </w:p>
     <w:p>
       <w:pPr>
@@ -1668,8 +1755,9 @@
     <w:tbl>
       <w:tblPr>
         <w:tblStyle w:val="Table"/>
-        <w:tblW w:type="pct" w:w="4999.999999999999"/>
-        <w:tblLook w:firstRow="1"/>
+        <w:tblW w:type="pct" w:w="5000"/>
+        <w:tblLook w:firstRow="1" w:lastRow="0" w:firstColumn="0" w:lastColumn="0" w:noHBand="0" w:noVBand="0" w:val="0020"/>
+        <w:jc w:val="start"/>
       </w:tblPr>
       <w:tblGrid>
         <w:gridCol w:w="395"/>
@@ -1684,15 +1772,10 @@
       </w:tblGrid>
       <w:tr>
         <w:trPr>
-          <w:cnfStyle w:firstRow="1"/>
+          <w:tblHeader w:val="true"/>
         </w:trPr>
         <w:tc>
-          <w:tcPr>
-            <w:tcBorders>
-              <w:bottom w:val="single"/>
-            </w:tcBorders>
-            <w:vAlign w:val="bottom"/>
-          </w:tcPr>
+          <w:tcPr/>
           <w:p>
             <w:pPr>
               <w:pStyle w:val="Compact"/>
@@ -1704,12 +1787,7 @@
           </w:p>
         </w:tc>
         <w:tc>
-          <w:tcPr>
-            <w:tcBorders>
-              <w:bottom w:val="single"/>
-            </w:tcBorders>
-            <w:vAlign w:val="bottom"/>
-          </w:tcPr>
+          <w:tcPr/>
           <w:p>
             <w:pPr>
               <w:pStyle w:val="Compact"/>
@@ -1721,12 +1799,7 @@
           </w:p>
         </w:tc>
         <w:tc>
-          <w:tcPr>
-            <w:tcBorders>
-              <w:bottom w:val="single"/>
-            </w:tcBorders>
-            <w:vAlign w:val="bottom"/>
-          </w:tcPr>
+          <w:tcPr/>
           <w:p>
             <w:pPr>
               <w:pStyle w:val="Compact"/>
@@ -1738,12 +1811,7 @@
           </w:p>
         </w:tc>
         <w:tc>
-          <w:tcPr>
-            <w:tcBorders>
-              <w:bottom w:val="single"/>
-            </w:tcBorders>
-            <w:vAlign w:val="bottom"/>
-          </w:tcPr>
+          <w:tcPr/>
           <w:p>
             <w:pPr>
               <w:pStyle w:val="Compact"/>
@@ -1755,12 +1823,7 @@
           </w:p>
         </w:tc>
         <w:tc>
-          <w:tcPr>
-            <w:tcBorders>
-              <w:bottom w:val="single"/>
-            </w:tcBorders>
-            <w:vAlign w:val="bottom"/>
-          </w:tcPr>
+          <w:tcPr/>
           <w:p>
             <w:pPr>
               <w:pStyle w:val="Compact"/>
@@ -1772,12 +1835,7 @@
           </w:p>
         </w:tc>
         <w:tc>
-          <w:tcPr>
-            <w:tcBorders>
-              <w:bottom w:val="single"/>
-            </w:tcBorders>
-            <w:vAlign w:val="bottom"/>
-          </w:tcPr>
+          <w:tcPr/>
           <w:p>
             <w:pPr>
               <w:pStyle w:val="Compact"/>
@@ -1789,12 +1847,7 @@
           </w:p>
         </w:tc>
         <w:tc>
-          <w:tcPr>
-            <w:tcBorders>
-              <w:bottom w:val="single"/>
-            </w:tcBorders>
-            <w:vAlign w:val="bottom"/>
-          </w:tcPr>
+          <w:tcPr/>
           <w:p>
             <w:pPr>
               <w:pStyle w:val="Compact"/>
@@ -1806,12 +1859,7 @@
           </w:p>
         </w:tc>
         <w:tc>
-          <w:tcPr>
-            <w:tcBorders>
-              <w:bottom w:val="single"/>
-            </w:tcBorders>
-            <w:vAlign w:val="bottom"/>
-          </w:tcPr>
+          <w:tcPr/>
           <w:p>
             <w:pPr>
               <w:pStyle w:val="Compact"/>
@@ -1823,12 +1871,7 @@
           </w:p>
         </w:tc>
         <w:tc>
-          <w:tcPr>
-            <w:tcBorders>
-              <w:bottom w:val="single"/>
-            </w:tcBorders>
-            <w:vAlign w:val="bottom"/>
-          </w:tcPr>
+          <w:tcPr/>
           <w:p>
             <w:pPr>
               <w:pStyle w:val="Compact"/>
@@ -1842,6 +1885,7 @@
       </w:tr>
       <w:tr>
         <w:tc>
+          <w:tcPr/>
           <w:p>
             <w:pPr>
               <w:pStyle w:val="Compact"/>
@@ -1853,6 +1897,7 @@
           </w:p>
         </w:tc>
         <w:tc>
+          <w:tcPr/>
           <w:p>
             <w:pPr>
               <w:pStyle w:val="Compact"/>
@@ -1864,6 +1909,7 @@
           </w:p>
         </w:tc>
         <w:tc>
+          <w:tcPr/>
           <w:p>
             <w:pPr>
               <w:pStyle w:val="Compact"/>
@@ -1875,6 +1921,7 @@
           </w:p>
         </w:tc>
         <w:tc>
+          <w:tcPr/>
           <w:p>
             <w:pPr>
               <w:pStyle w:val="Compact"/>
@@ -1886,6 +1933,7 @@
           </w:p>
         </w:tc>
         <w:tc>
+          <w:tcPr/>
           <w:p>
             <w:pPr>
               <w:pStyle w:val="Compact"/>
@@ -1897,6 +1945,7 @@
           </w:p>
         </w:tc>
         <w:tc>
+          <w:tcPr/>
           <w:p>
             <w:pPr>
               <w:pStyle w:val="Compact"/>
@@ -1908,6 +1957,7 @@
           </w:p>
         </w:tc>
         <w:tc>
+          <w:tcPr/>
           <w:p>
             <w:pPr>
               <w:pStyle w:val="Compact"/>
@@ -1919,6 +1969,7 @@
           </w:p>
         </w:tc>
         <w:tc>
+          <w:tcPr/>
           <w:p>
             <w:pPr>
               <w:pStyle w:val="Compact"/>
@@ -1930,6 +1981,7 @@
           </w:p>
         </w:tc>
         <w:tc>
+          <w:tcPr/>
           <w:p>
             <w:pPr>
               <w:pStyle w:val="Compact"/>
@@ -1943,6 +1995,7 @@
       </w:tr>
       <w:tr>
         <w:tc>
+          <w:tcPr/>
           <w:p>
             <w:pPr>
               <w:pStyle w:val="Compact"/>
@@ -1954,6 +2007,7 @@
           </w:p>
         </w:tc>
         <w:tc>
+          <w:tcPr/>
           <w:p>
             <w:pPr>
               <w:pStyle w:val="Compact"/>
@@ -1965,6 +2019,7 @@
           </w:p>
         </w:tc>
         <w:tc>
+          <w:tcPr/>
           <w:p>
             <w:pPr>
               <w:pStyle w:val="Compact"/>
@@ -1976,6 +2031,7 @@
           </w:p>
         </w:tc>
         <w:tc>
+          <w:tcPr/>
           <w:p>
             <w:pPr>
               <w:pStyle w:val="Compact"/>
@@ -1987,6 +2043,7 @@
           </w:p>
         </w:tc>
         <w:tc>
+          <w:tcPr/>
           <w:p>
             <w:pPr>
               <w:pStyle w:val="Compact"/>
@@ -1998,6 +2055,7 @@
           </w:p>
         </w:tc>
         <w:tc>
+          <w:tcPr/>
           <w:p>
             <w:pPr>
               <w:pStyle w:val="Compact"/>
@@ -2009,6 +2067,7 @@
           </w:p>
         </w:tc>
         <w:tc>
+          <w:tcPr/>
           <w:p>
             <w:pPr>
               <w:pStyle w:val="Compact"/>
@@ -2020,6 +2079,7 @@
           </w:p>
         </w:tc>
         <w:tc>
+          <w:tcPr/>
           <w:p>
             <w:pPr>
               <w:pStyle w:val="Compact"/>
@@ -2031,6 +2091,7 @@
           </w:p>
         </w:tc>
         <w:tc>
+          <w:tcPr/>
           <w:p>
             <w:pPr>
               <w:pStyle w:val="Compact"/>
@@ -2044,6 +2105,7 @@
       </w:tr>
       <w:tr>
         <w:tc>
+          <w:tcPr/>
           <w:p>
             <w:pPr>
               <w:pStyle w:val="Compact"/>
@@ -2055,6 +2117,7 @@
           </w:p>
         </w:tc>
         <w:tc>
+          <w:tcPr/>
           <w:p>
             <w:pPr>
               <w:pStyle w:val="Compact"/>
@@ -2066,6 +2129,7 @@
           </w:p>
         </w:tc>
         <w:tc>
+          <w:tcPr/>
           <w:p>
             <w:pPr>
               <w:pStyle w:val="Compact"/>
@@ -2077,6 +2141,7 @@
           </w:p>
         </w:tc>
         <w:tc>
+          <w:tcPr/>
           <w:p>
             <w:pPr>
               <w:pStyle w:val="Compact"/>
@@ -2088,6 +2153,7 @@
           </w:p>
         </w:tc>
         <w:tc>
+          <w:tcPr/>
           <w:p>
             <w:pPr>
               <w:pStyle w:val="Compact"/>
@@ -2099,6 +2165,7 @@
           </w:p>
         </w:tc>
         <w:tc>
+          <w:tcPr/>
           <w:p>
             <w:pPr>
               <w:pStyle w:val="Compact"/>
@@ -2110,6 +2177,7 @@
           </w:p>
         </w:tc>
         <w:tc>
+          <w:tcPr/>
           <w:p>
             <w:pPr>
               <w:pStyle w:val="Compact"/>
@@ -2121,6 +2189,7 @@
           </w:p>
         </w:tc>
         <w:tc>
+          <w:tcPr/>
           <w:p>
             <w:pPr>
               <w:pStyle w:val="Compact"/>
@@ -2132,6 +2201,7 @@
           </w:p>
         </w:tc>
         <w:tc>
+          <w:tcPr/>
           <w:p>
             <w:pPr>
               <w:pStyle w:val="Compact"/>
@@ -2145,6 +2215,7 @@
       </w:tr>
       <w:tr>
         <w:tc>
+          <w:tcPr/>
           <w:p>
             <w:pPr>
               <w:pStyle w:val="Compact"/>
@@ -2156,6 +2227,7 @@
           </w:p>
         </w:tc>
         <w:tc>
+          <w:tcPr/>
           <w:p>
             <w:pPr>
               <w:pStyle w:val="Compact"/>
@@ -2167,6 +2239,7 @@
           </w:p>
         </w:tc>
         <w:tc>
+          <w:tcPr/>
           <w:p>
             <w:pPr>
               <w:pStyle w:val="Compact"/>
@@ -2178,6 +2251,7 @@
           </w:p>
         </w:tc>
         <w:tc>
+          <w:tcPr/>
           <w:p>
             <w:pPr>
               <w:pStyle w:val="Compact"/>
@@ -2189,6 +2263,7 @@
           </w:p>
         </w:tc>
         <w:tc>
+          <w:tcPr/>
           <w:p>
             <w:pPr>
               <w:pStyle w:val="Compact"/>
@@ -2200,6 +2275,7 @@
           </w:p>
         </w:tc>
         <w:tc>
+          <w:tcPr/>
           <w:p>
             <w:pPr>
               <w:pStyle w:val="Compact"/>
@@ -2211,6 +2287,7 @@
           </w:p>
         </w:tc>
         <w:tc>
+          <w:tcPr/>
           <w:p>
             <w:pPr>
               <w:pStyle w:val="Compact"/>
@@ -2222,6 +2299,7 @@
           </w:p>
         </w:tc>
         <w:tc>
+          <w:tcPr/>
           <w:p>
             <w:pPr>
               <w:pStyle w:val="Compact"/>
@@ -2233,6 +2311,7 @@
           </w:p>
         </w:tc>
         <w:tc>
+          <w:tcPr/>
           <w:p>
             <w:pPr>
               <w:pStyle w:val="Compact"/>
@@ -2246,6 +2325,7 @@
       </w:tr>
       <w:tr>
         <w:tc>
+          <w:tcPr/>
           <w:p>
             <w:pPr>
               <w:pStyle w:val="Compact"/>
@@ -2257,6 +2337,7 @@
           </w:p>
         </w:tc>
         <w:tc>
+          <w:tcPr/>
           <w:p>
             <w:pPr>
               <w:pStyle w:val="Compact"/>
@@ -2268,6 +2349,7 @@
           </w:p>
         </w:tc>
         <w:tc>
+          <w:tcPr/>
           <w:p>
             <w:pPr>
               <w:pStyle w:val="Compact"/>
@@ -2279,6 +2361,7 @@
           </w:p>
         </w:tc>
         <w:tc>
+          <w:tcPr/>
           <w:p>
             <w:pPr>
               <w:pStyle w:val="Compact"/>
@@ -2290,6 +2373,7 @@
           </w:p>
         </w:tc>
         <w:tc>
+          <w:tcPr/>
           <w:p>
             <w:pPr>
               <w:pStyle w:val="Compact"/>
@@ -2301,6 +2385,7 @@
           </w:p>
         </w:tc>
         <w:tc>
+          <w:tcPr/>
           <w:p>
             <w:pPr>
               <w:pStyle w:val="Compact"/>
@@ -2312,6 +2397,7 @@
           </w:p>
         </w:tc>
         <w:tc>
+          <w:tcPr/>
           <w:p>
             <w:pPr>
               <w:pStyle w:val="Compact"/>
@@ -2323,6 +2409,7 @@
           </w:p>
         </w:tc>
         <w:tc>
+          <w:tcPr/>
           <w:p>
             <w:pPr>
               <w:pStyle w:val="Compact"/>
@@ -2334,6 +2421,7 @@
           </w:p>
         </w:tc>
         <w:tc>
+          <w:tcPr/>
           <w:p>
             <w:pPr>
               <w:pStyle w:val="Compact"/>
@@ -2347,6 +2435,7 @@
       </w:tr>
       <w:tr>
         <w:tc>
+          <w:tcPr/>
           <w:p>
             <w:pPr>
               <w:pStyle w:val="Compact"/>
@@ -2358,6 +2447,7 @@
           </w:p>
         </w:tc>
         <w:tc>
+          <w:tcPr/>
           <w:p>
             <w:pPr>
               <w:pStyle w:val="Compact"/>
@@ -2369,6 +2459,7 @@
           </w:p>
         </w:tc>
         <w:tc>
+          <w:tcPr/>
           <w:p>
             <w:pPr>
               <w:pStyle w:val="Compact"/>
@@ -2380,6 +2471,7 @@
           </w:p>
         </w:tc>
         <w:tc>
+          <w:tcPr/>
           <w:p>
             <w:pPr>
               <w:pStyle w:val="Compact"/>
@@ -2391,6 +2483,7 @@
           </w:p>
         </w:tc>
         <w:tc>
+          <w:tcPr/>
           <w:p>
             <w:pPr>
               <w:pStyle w:val="Compact"/>
@@ -2402,6 +2495,7 @@
           </w:p>
         </w:tc>
         <w:tc>
+          <w:tcPr/>
           <w:p>
             <w:pPr>
               <w:pStyle w:val="Compact"/>
@@ -2413,6 +2507,7 @@
           </w:p>
         </w:tc>
         <w:tc>
+          <w:tcPr/>
           <w:p>
             <w:pPr>
               <w:pStyle w:val="Compact"/>
@@ -2424,6 +2519,7 @@
           </w:p>
         </w:tc>
         <w:tc>
+          <w:tcPr/>
           <w:p>
             <w:pPr>
               <w:pStyle w:val="Compact"/>
@@ -2435,6 +2531,7 @@
           </w:p>
         </w:tc>
         <w:tc>
+          <w:tcPr/>
           <w:p>
             <w:pPr>
               <w:pStyle w:val="Compact"/>
@@ -2448,6 +2545,7 @@
       </w:tr>
       <w:tr>
         <w:tc>
+          <w:tcPr/>
           <w:p>
             <w:pPr>
               <w:pStyle w:val="Compact"/>
@@ -2459,6 +2557,7 @@
           </w:p>
         </w:tc>
         <w:tc>
+          <w:tcPr/>
           <w:p>
             <w:pPr>
               <w:pStyle w:val="Compact"/>
@@ -2470,6 +2569,7 @@
           </w:p>
         </w:tc>
         <w:tc>
+          <w:tcPr/>
           <w:p>
             <w:pPr>
               <w:pStyle w:val="Compact"/>
@@ -2481,6 +2581,7 @@
           </w:p>
         </w:tc>
         <w:tc>
+          <w:tcPr/>
           <w:p>
             <w:pPr>
               <w:pStyle w:val="Compact"/>
@@ -2492,6 +2593,7 @@
           </w:p>
         </w:tc>
         <w:tc>
+          <w:tcPr/>
           <w:p>
             <w:pPr>
               <w:pStyle w:val="Compact"/>
@@ -2503,6 +2605,7 @@
           </w:p>
         </w:tc>
         <w:tc>
+          <w:tcPr/>
           <w:p>
             <w:pPr>
               <w:pStyle w:val="Compact"/>
@@ -2514,6 +2617,7 @@
           </w:p>
         </w:tc>
         <w:tc>
+          <w:tcPr/>
           <w:p>
             <w:pPr>
               <w:pStyle w:val="Compact"/>
@@ -2525,6 +2629,7 @@
           </w:p>
         </w:tc>
         <w:tc>
+          <w:tcPr/>
           <w:p>
             <w:pPr>
               <w:pStyle w:val="Compact"/>
@@ -2536,6 +2641,7 @@
           </w:p>
         </w:tc>
         <w:tc>
+          <w:tcPr/>
           <w:p>
             <w:pPr>
               <w:pStyle w:val="Compact"/>
@@ -2549,6 +2655,7 @@
       </w:tr>
       <w:tr>
         <w:tc>
+          <w:tcPr/>
           <w:p>
             <w:pPr>
               <w:pStyle w:val="Compact"/>
@@ -2560,6 +2667,7 @@
           </w:p>
         </w:tc>
         <w:tc>
+          <w:tcPr/>
           <w:p>
             <w:pPr>
               <w:pStyle w:val="Compact"/>
@@ -2571,6 +2679,7 @@
           </w:p>
         </w:tc>
         <w:tc>
+          <w:tcPr/>
           <w:p>
             <w:pPr>
               <w:pStyle w:val="Compact"/>
@@ -2582,6 +2691,7 @@
           </w:p>
         </w:tc>
         <w:tc>
+          <w:tcPr/>
           <w:p>
             <w:pPr>
               <w:pStyle w:val="Compact"/>
@@ -2593,6 +2703,7 @@
           </w:p>
         </w:tc>
         <w:tc>
+          <w:tcPr/>
           <w:p>
             <w:pPr>
               <w:pStyle w:val="Compact"/>
@@ -2604,6 +2715,7 @@
           </w:p>
         </w:tc>
         <w:tc>
+          <w:tcPr/>
           <w:p>
             <w:pPr>
               <w:pStyle w:val="Compact"/>
@@ -2615,6 +2727,7 @@
           </w:p>
         </w:tc>
         <w:tc>
+          <w:tcPr/>
           <w:p>
             <w:pPr>
               <w:pStyle w:val="Compact"/>
@@ -2626,6 +2739,7 @@
           </w:p>
         </w:tc>
         <w:tc>
+          <w:tcPr/>
           <w:p>
             <w:pPr>
               <w:pStyle w:val="Compact"/>
@@ -2637,6 +2751,7 @@
           </w:p>
         </w:tc>
         <w:tc>
+          <w:tcPr/>
           <w:p>
             <w:pPr>
               <w:pStyle w:val="Compact"/>
@@ -2657,15 +2772,15 @@
         <w:t xml:space="preserve">H-7 is the finding to carry forward: the actuation side of the loop, not the display, would carry the highest ASIL in a production programme. That is why the manoeuvre is specified as a safety mechanism with a recovery window (SM-3) rather than as a feature.</w:t>
       </w:r>
     </w:p>
+    <w:bookmarkEnd w:id="25"/>
+    <w:bookmarkStart w:id="36" w:name="safety-mechanisms"/>
     <w:p>
       <w:pPr>
         <w:pStyle w:val="Heading1"/>
       </w:pPr>
-      <w:bookmarkStart w:id="26" w:name="safety-mechanisms"/>
       <w:r>
         <w:t xml:space="preserve">5. Safety mechanisms</w:t>
       </w:r>
-      <w:bookmarkEnd w:id="26"/>
     </w:p>
     <w:p>
       <w:pPr>
@@ -2676,18 +2791,18 @@
           <wp:inline>
             <wp:extent cx="5334000" cy="2217505"/>
             <wp:effectExtent b="0" l="0" r="0" t="0"/>
-            <wp:docPr descr="Where each safety mechanism sits on the signal path, and which hazards it addresses. Ratings are proposals." title="" id="1" name="Picture"/>
+            <wp:docPr descr="Where each safety mechanism sits on the signal path, and which hazards it addresses. Ratings are proposals." title="" id="27" name="Picture"/>
             <a:graphic>
               <a:graphicData uri="http://schemas.openxmlformats.org/drawingml/2006/picture">
                 <pic:pic>
                   <pic:nvPicPr>
-                    <pic:cNvPr descr="diagrams/safety-mechanisms.png" id="0" name="Picture"/>
+                    <pic:cNvPr descr="diagrams/safety-mechanisms.png" id="28" name="Picture"/>
                     <pic:cNvPicPr>
                       <a:picLocks noChangeArrowheads="1" noChangeAspect="1"/>
                     </pic:cNvPicPr>
                   </pic:nvPicPr>
                   <pic:blipFill>
-                    <a:blip r:embed="rId27"/>
+                    <a:blip r:embed="rId26"/>
                     <a:stretch>
                       <a:fillRect/>
                     </a:stretch>
@@ -2742,15 +2857,14 @@
         <w:t xml:space="preserve">.</w:t>
       </w:r>
     </w:p>
+    <w:bookmarkStart w:id="29" w:name="Xbf45deed96f9cb727831c25a91f27cc36acfb22"/>
     <w:p>
       <w:pPr>
         <w:pStyle w:val="Heading2"/>
       </w:pPr>
-      <w:bookmarkStart w:id="28" w:name="Xbf45deed96f9cb727831c25a91f27cc36acfb22"/>
       <w:r>
         <w:t xml:space="preserve">SM-1 Staleness detection and degraded display (SR-4, SR-5)</w:t>
       </w:r>
-      <w:bookmarkEnd w:id="28"/>
     </w:p>
     <w:p>
       <w:pPr>
@@ -2760,15 +2874,15 @@
         <w:t xml:space="preserve">Each HMI shall track the arrival time of every safety-relevant signal and compare it to the freshness criterion in section 3 at least every 100 ms. Loss of the broker connection shall be treated as all signals stale at once. The degraded presentation in section 3 shall replace the value. Implemented in sprint 2: the Flutter cluster degrades within one second of the broker stopping, verified on screen and by widget test; the Compose cluster carries the same model, verified by compilation and unit test, not yet on a device.</w:t>
       </w:r>
     </w:p>
+    <w:bookmarkEnd w:id="29"/>
+    <w:bookmarkStart w:id="30" w:name="sm-2-fail-visibly-sr-6"/>
     <w:p>
       <w:pPr>
         <w:pStyle w:val="Heading2"/>
       </w:pPr>
-      <w:bookmarkStart w:id="29" w:name="sm-2-fail-visibly-sr-6"/>
       <w:r>
         <w:t xml:space="preserve">SM-2 Fail visibly (SR-6)</w:t>
       </w:r>
-      <w:bookmarkEnd w:id="29"/>
     </w:p>
     <w:p>
       <w:pPr>
@@ -2778,15 +2892,15 @@
         <w:t xml:space="preserve">A rendering fault shall not present a plausible but wrong value. Two mechanisms are proposed for the demonstrator. First, a heartbeat glyph that the renderer toggles every frame from the signal timestamp, so a frozen renderer becomes visible within one second. Second, a self-check that the speed numeral actually drawn matches the state value. A production programme would need more than this: a qualified renderer, or a supervisor that verifies the output (DD-1 in PULSE-SAD-001). Planned sprint 3.</w:t>
       </w:r>
     </w:p>
+    <w:bookmarkEnd w:id="30"/>
+    <w:bookmarkStart w:id="34" w:name="Xb26b79154048dc73f548520cfdce3745878f439"/>
     <w:p>
       <w:pPr>
         <w:pStyle w:val="Heading2"/>
       </w:pPr>
-      <w:bookmarkStart w:id="30" w:name="Xb26b79154048dc73f548520cfdce3745878f439"/>
       <w:r>
         <w:t xml:space="preserve">SM-3 Minimum-risk manoeuvre on sustained drowsiness (SR-7)</w:t>
       </w:r>
-      <w:bookmarkEnd w:id="30"/>
     </w:p>
     <w:p>
       <w:pPr>
@@ -2797,12 +2911,12 @@
           <wp:inline>
             <wp:extent cx="5334000" cy="1539781"/>
             <wp:effectExtent b="0" l="0" r="0" t="0"/>
-            <wp:docPr descr="SM-3 as a state machine. Trigger, recovery window, escalation, abort and resume, with the current parameters." title="" id="1" name="Picture"/>
+            <wp:docPr descr="SM-3 as a state machine. Trigger, recovery window, escalation, abort and resume, with the current parameters." title="" id="32" name="Picture"/>
             <a:graphic>
               <a:graphicData uri="http://schemas.openxmlformats.org/drawingml/2006/picture">
                 <pic:pic>
                   <pic:nvPicPr>
-                    <pic:cNvPr descr="diagrams/mrm-state-machine.png" id="0" name="Picture"/>
+                    <pic:cNvPr descr="diagrams/mrm-state-machine.png" id="33" name="Picture"/>
                     <pic:cNvPicPr>
                       <a:picLocks noChangeArrowheads="1" noChangeAspect="1"/>
                     </pic:cNvPicPr>
@@ -2866,8 +2980,9 @@
     <w:tbl>
       <w:tblPr>
         <w:tblStyle w:val="Table"/>
-        <w:tblW w:type="pct" w:w="5000.0"/>
-        <w:tblLook w:firstRow="1"/>
+        <w:tblW w:type="pct" w:w="5000"/>
+        <w:tblLook w:firstRow="1" w:lastRow="0" w:firstColumn="0" w:lastColumn="0" w:noHBand="0" w:noVBand="0" w:val="0020"/>
+        <w:jc w:val="start"/>
       </w:tblPr>
       <w:tblGrid>
         <w:gridCol w:w="1584"/>
@@ -2876,15 +2991,10 @@
       </w:tblGrid>
       <w:tr>
         <w:trPr>
-          <w:cnfStyle w:firstRow="1"/>
+          <w:tblHeader w:val="true"/>
         </w:trPr>
         <w:tc>
-          <w:tcPr>
-            <w:tcBorders>
-              <w:bottom w:val="single"/>
-            </w:tcBorders>
-            <w:vAlign w:val="bottom"/>
-          </w:tcPr>
+          <w:tcPr/>
           <w:p>
             <w:pPr>
               <w:pStyle w:val="Compact"/>
@@ -2896,12 +3006,7 @@
           </w:p>
         </w:tc>
         <w:tc>
-          <w:tcPr>
-            <w:tcBorders>
-              <w:bottom w:val="single"/>
-            </w:tcBorders>
-            <w:vAlign w:val="bottom"/>
-          </w:tcPr>
+          <w:tcPr/>
           <w:p>
             <w:pPr>
               <w:pStyle w:val="Compact"/>
@@ -2913,12 +3018,7 @@
           </w:p>
         </w:tc>
         <w:tc>
-          <w:tcPr>
-            <w:tcBorders>
-              <w:bottom w:val="single"/>
-            </w:tcBorders>
-            <w:vAlign w:val="bottom"/>
-          </w:tcPr>
+          <w:tcPr/>
           <w:p>
             <w:pPr>
               <w:pStyle w:val="Compact"/>
@@ -2932,6 +3032,7 @@
       </w:tr>
       <w:tr>
         <w:tc>
+          <w:tcPr/>
           <w:p>
             <w:pPr>
               <w:pStyle w:val="Compact"/>
@@ -2943,6 +3044,7 @@
           </w:p>
         </w:tc>
         <w:tc>
+          <w:tcPr/>
           <w:p>
             <w:pPr>
               <w:pStyle w:val="Compact"/>
@@ -2954,6 +3056,7 @@
           </w:p>
         </w:tc>
         <w:tc>
+          <w:tcPr/>
           <w:p>
             <w:pPr>
               <w:pStyle w:val="Compact"/>
@@ -2976,6 +3079,7 @@
       </w:tr>
       <w:tr>
         <w:tc>
+          <w:tcPr/>
           <w:p>
             <w:pPr>
               <w:pStyle w:val="Compact"/>
@@ -2987,6 +3091,7 @@
           </w:p>
         </w:tc>
         <w:tc>
+          <w:tcPr/>
           <w:p>
             <w:pPr>
               <w:pStyle w:val="Compact"/>
@@ -2998,6 +3103,7 @@
           </w:p>
         </w:tc>
         <w:tc>
+          <w:tcPr/>
           <w:p>
             <w:pPr>
               <w:pStyle w:val="Compact"/>
@@ -3020,6 +3126,7 @@
       </w:tr>
       <w:tr>
         <w:tc>
+          <w:tcPr/>
           <w:p>
             <w:pPr>
               <w:pStyle w:val="Compact"/>
@@ -3031,6 +3138,7 @@
           </w:p>
         </w:tc>
         <w:tc>
+          <w:tcPr/>
           <w:p>
             <w:pPr>
               <w:pStyle w:val="Compact"/>
@@ -3042,6 +3150,7 @@
           </w:p>
         </w:tc>
         <w:tc>
+          <w:tcPr/>
           <w:p>
             <w:pPr>
               <w:pStyle w:val="Compact"/>
@@ -3055,6 +3164,7 @@
       </w:tr>
       <w:tr>
         <w:tc>
+          <w:tcPr/>
           <w:p>
             <w:pPr>
               <w:pStyle w:val="Compact"/>
@@ -3066,6 +3176,7 @@
           </w:p>
         </w:tc>
         <w:tc>
+          <w:tcPr/>
           <w:p>
             <w:pPr>
               <w:pStyle w:val="Compact"/>
@@ -3077,6 +3188,7 @@
           </w:p>
         </w:tc>
         <w:tc>
+          <w:tcPr/>
           <w:p>
             <w:pPr>
               <w:pStyle w:val="Compact"/>
@@ -3090,6 +3202,7 @@
       </w:tr>
       <w:tr>
         <w:tc>
+          <w:tcPr/>
           <w:p>
             <w:pPr>
               <w:pStyle w:val="Compact"/>
@@ -3101,6 +3214,7 @@
           </w:p>
         </w:tc>
         <w:tc>
+          <w:tcPr/>
           <w:p>
             <w:pPr>
               <w:pStyle w:val="Compact"/>
@@ -3112,6 +3226,7 @@
           </w:p>
         </w:tc>
         <w:tc>
+          <w:tcPr/>
           <w:p>
             <w:pPr>
               <w:pStyle w:val="Compact"/>
@@ -3134,6 +3249,7 @@
       </w:tr>
       <w:tr>
         <w:tc>
+          <w:tcPr/>
           <w:p>
             <w:pPr>
               <w:pStyle w:val="Compact"/>
@@ -3145,6 +3261,7 @@
           </w:p>
         </w:tc>
         <w:tc>
+          <w:tcPr/>
           <w:p>
             <w:pPr>
               <w:pStyle w:val="Compact"/>
@@ -3156,6 +3273,7 @@
           </w:p>
         </w:tc>
         <w:tc>
+          <w:tcPr/>
           <w:p>
             <w:pPr>
               <w:pStyle w:val="Compact"/>
@@ -3176,15 +3294,15 @@
         <w:t xml:space="preserve">Implemented in the simulator’s cruise mode (FR-20). On a real vehicle the escalation moves to a motion controller; the trigger and status signal contract stays.</w:t>
       </w:r>
     </w:p>
+    <w:bookmarkEnd w:id="34"/>
+    <w:bookmarkStart w:id="35" w:name="X92227b9fbb5cfe0508dd36bf045e368e87e96c8"/>
     <w:p>
       <w:pPr>
         <w:pStyle w:val="Heading2"/>
       </w:pPr>
-      <w:bookmarkStart w:id="32" w:name="X92227b9fbb5cfe0508dd36bf045e368e87e96c8"/>
       <w:r>
         <w:t xml:space="preserve">SM-4 Range validation at the broker (shared with CS-5)</w:t>
       </w:r>
-      <w:bookmarkEnd w:id="32"/>
     </w:p>
     <w:p>
       <w:pPr>
@@ -3194,15 +3312,16 @@
         <w:t xml:space="preserve">The broker rejects values outside the catalogue’s datatype, allowed list or range, so a faulty provider cannot drive an impossible value onto the display. Implemented by KUKSA; a client-side check is added in sprint 2.</w:t>
       </w:r>
     </w:p>
+    <w:bookmarkEnd w:id="35"/>
+    <w:bookmarkEnd w:id="36"/>
+    <w:bookmarkStart w:id="37" w:name="freedom-from-interference-sr-8"/>
     <w:p>
       <w:pPr>
         <w:pStyle w:val="Heading1"/>
       </w:pPr>
-      <w:bookmarkStart w:id="33" w:name="freedom-from-interference-sr-8"/>
       <w:r>
         <w:t xml:space="preserve">6. Freedom from interference (SR-8)</w:t>
       </w:r>
-      <w:bookmarkEnd w:id="33"/>
     </w:p>
     <w:p>
       <w:pPr>
@@ -3214,11 +3333,11 @@
     </w:p>
     <w:p>
       <w:pPr>
+        <w:numPr>
+          <w:ilvl w:val="0"/>
+          <w:numId w:val="1001"/>
+        </w:numPr>
         <w:pStyle w:val="Compact"/>
-        <w:numPr>
-          <w:numId w:val="1001"/>
-          <w:ilvl w:val="0"/>
-        </w:numPr>
       </w:pPr>
       <w:r>
         <w:t xml:space="preserve">Spatial: the cluster and any infotainment surface run as separate processes; on the target, separate Wayland surfaces with the cluster surface always on top.</w:t>
@@ -3226,11 +3345,11 @@
     </w:p>
     <w:p>
       <w:pPr>
+        <w:numPr>
+          <w:ilvl w:val="0"/>
+          <w:numId w:val="1001"/>
+        </w:numPr>
         <w:pStyle w:val="Compact"/>
-        <w:numPr>
-          <w:numId w:val="1001"/>
-          <w:ilvl w:val="0"/>
-        </w:numPr>
       </w:pPr>
       <w:r>
         <w:t xml:space="preserve">Temporal: the cluster’s render loop does not depend on any infotainment process; broker fan-out is per-stream, so a slow subscriber does not delay another.</w:t>
@@ -3238,11 +3357,11 @@
     </w:p>
     <w:p>
       <w:pPr>
+        <w:numPr>
+          <w:ilvl w:val="0"/>
+          <w:numId w:val="1001"/>
+        </w:numPr>
         <w:pStyle w:val="Compact"/>
-        <w:numPr>
-          <w:numId w:val="1001"/>
-          <w:ilvl w:val="0"/>
-        </w:numPr>
       </w:pPr>
       <w:r>
         <w:t xml:space="preserve">Communication: infotainment is a subscriber only (CS-4 write authorisation); it cannot publish a safety-relevant signal.</w:t>
@@ -3250,49 +3369,50 @@
     </w:p>
     <w:p>
       <w:pPr>
+        <w:numPr>
+          <w:ilvl w:val="0"/>
+          <w:numId w:val="1001"/>
+        </w:numPr>
         <w:pStyle w:val="Compact"/>
-        <w:numPr>
-          <w:numId w:val="1001"/>
-          <w:ilvl w:val="0"/>
-        </w:numPr>
       </w:pPr>
       <w:r>
         <w:t xml:space="preserve">Evidence to produce: a stress test in which an infotainment process saturates CPU and the cluster’s frame time is measured.</w:t>
+      </w:r>
+    </w:p>
+    <w:bookmarkEnd w:id="37"/>
+    <w:bookmarkStart w:id="38" w:name="documented-deviations-sr-10"/>
+    <w:p>
+      <w:pPr>
+        <w:pStyle w:val="Heading1"/>
+      </w:pPr>
+      <w:r>
+        <w:t xml:space="preserve">7. Documented deviations (SR-10)</w:t>
       </w:r>
     </w:p>
     <w:p>
       <w:pPr>
+        <w:pStyle w:val="FirstParagraph"/>
+      </w:pPr>
+      <w:r>
+        <w:t xml:space="preserve">Held in PULSE-SAD-001 section 8, decisions DD-1 to DD-11. The ones that would block a later ASIL argument are DD-1 (unqualified renderer), DD-3 (container runtime), DD-7 (desk window system) and DD-9 (actuation in the simulator).</w:t>
+      </w:r>
+    </w:p>
+    <w:bookmarkEnd w:id="38"/>
+    <w:bookmarkStart w:id="39" w:name="qualification-gap-list-sr-11"/>
+    <w:p>
+      <w:pPr>
         <w:pStyle w:val="Heading1"/>
       </w:pPr>
-      <w:bookmarkStart w:id="34" w:name="documented-deviations-sr-10"/>
-      <w:r>
-        <w:t xml:space="preserve">7. Documented deviations (SR-10)</w:t>
-      </w:r>
-      <w:bookmarkEnd w:id="34"/>
-    </w:p>
-    <w:p>
-      <w:pPr>
-        <w:pStyle w:val="FirstParagraph"/>
-      </w:pPr>
-      <w:r>
-        <w:t xml:space="preserve">Held in PULSE-SAD-001 section 8, decisions DD-1 to DD-11. The ones that would block a later ASIL argument are DD-1 (unqualified renderer), DD-3 (container runtime), DD-7 (desk window system) and DD-9 (actuation in the simulator).</w:t>
-      </w:r>
-    </w:p>
-    <w:p>
-      <w:pPr>
-        <w:pStyle w:val="Heading1"/>
-      </w:pPr>
-      <w:bookmarkStart w:id="35" w:name="qualification-gap-list-sr-11"/>
       <w:r>
         <w:t xml:space="preserve">8. Qualification gap list (SR-11)</w:t>
       </w:r>
-      <w:bookmarkEnd w:id="35"/>
     </w:p>
     <w:tbl>
       <w:tblPr>
         <w:tblStyle w:val="Table"/>
-        <w:tblW w:type="pct" w:w="5000.0"/>
-        <w:tblLook w:firstRow="1"/>
+        <w:tblW w:type="pct" w:w="5000"/>
+        <w:tblLook w:firstRow="1" w:lastRow="0" w:firstColumn="0" w:lastColumn="0" w:noHBand="0" w:noVBand="0" w:val="0020"/>
+        <w:jc w:val="start"/>
       </w:tblPr>
       <w:tblGrid>
         <w:gridCol w:w="1584"/>
@@ -3301,15 +3421,10 @@
       </w:tblGrid>
       <w:tr>
         <w:trPr>
-          <w:cnfStyle w:firstRow="1"/>
+          <w:tblHeader w:val="true"/>
         </w:trPr>
         <w:tc>
-          <w:tcPr>
-            <w:tcBorders>
-              <w:bottom w:val="single"/>
-            </w:tcBorders>
-            <w:vAlign w:val="bottom"/>
-          </w:tcPr>
+          <w:tcPr/>
           <w:p>
             <w:pPr>
               <w:pStyle w:val="Compact"/>
@@ -3321,12 +3436,7 @@
           </w:p>
         </w:tc>
         <w:tc>
-          <w:tcPr>
-            <w:tcBorders>
-              <w:bottom w:val="single"/>
-            </w:tcBorders>
-            <w:vAlign w:val="bottom"/>
-          </w:tcPr>
+          <w:tcPr/>
           <w:p>
             <w:pPr>
               <w:pStyle w:val="Compact"/>
@@ -3338,12 +3448,7 @@
           </w:p>
         </w:tc>
         <w:tc>
-          <w:tcPr>
-            <w:tcBorders>
-              <w:bottom w:val="single"/>
-            </w:tcBorders>
-            <w:vAlign w:val="bottom"/>
-          </w:tcPr>
+          <w:tcPr/>
           <w:p>
             <w:pPr>
               <w:pStyle w:val="Compact"/>
@@ -3357,6 +3462,7 @@
       </w:tr>
       <w:tr>
         <w:tc>
+          <w:tcPr/>
           <w:p>
             <w:pPr>
               <w:pStyle w:val="Compact"/>
@@ -3368,6 +3474,7 @@
           </w:p>
         </w:tc>
         <w:tc>
+          <w:tcPr/>
           <w:p>
             <w:pPr>
               <w:pStyle w:val="Compact"/>
@@ -3379,6 +3486,7 @@
           </w:p>
         </w:tc>
         <w:tc>
+          <w:tcPr/>
           <w:p>
             <w:pPr>
               <w:pStyle w:val="Compact"/>
@@ -3392,6 +3500,7 @@
       </w:tr>
       <w:tr>
         <w:tc>
+          <w:tcPr/>
           <w:p>
             <w:pPr>
               <w:pStyle w:val="Compact"/>
@@ -3403,6 +3512,7 @@
           </w:p>
         </w:tc>
         <w:tc>
+          <w:tcPr/>
           <w:p>
             <w:pPr>
               <w:pStyle w:val="Compact"/>
@@ -3414,6 +3524,7 @@
           </w:p>
         </w:tc>
         <w:tc>
+          <w:tcPr/>
           <w:p>
             <w:pPr>
               <w:pStyle w:val="Compact"/>
@@ -3427,6 +3538,7 @@
       </w:tr>
       <w:tr>
         <w:tc>
+          <w:tcPr/>
           <w:p>
             <w:pPr>
               <w:pStyle w:val="Compact"/>
@@ -3438,6 +3550,7 @@
           </w:p>
         </w:tc>
         <w:tc>
+          <w:tcPr/>
           <w:p>
             <w:pPr>
               <w:pStyle w:val="Compact"/>
@@ -3449,6 +3562,7 @@
           </w:p>
         </w:tc>
         <w:tc>
+          <w:tcPr/>
           <w:p>
             <w:pPr>
               <w:pStyle w:val="Compact"/>
@@ -3462,6 +3576,7 @@
       </w:tr>
       <w:tr>
         <w:tc>
+          <w:tcPr/>
           <w:p>
             <w:pPr>
               <w:pStyle w:val="Compact"/>
@@ -3473,6 +3588,7 @@
           </w:p>
         </w:tc>
         <w:tc>
+          <w:tcPr/>
           <w:p>
             <w:pPr>
               <w:pStyle w:val="Compact"/>
@@ -3484,6 +3600,7 @@
           </w:p>
         </w:tc>
         <w:tc>
+          <w:tcPr/>
           <w:p>
             <w:pPr>
               <w:pStyle w:val="Compact"/>
@@ -3497,6 +3614,7 @@
       </w:tr>
       <w:tr>
         <w:tc>
+          <w:tcPr/>
           <w:p>
             <w:pPr>
               <w:pStyle w:val="Compact"/>
@@ -3508,6 +3626,7 @@
           </w:p>
         </w:tc>
         <w:tc>
+          <w:tcPr/>
           <w:p>
             <w:pPr>
               <w:pStyle w:val="Compact"/>
@@ -3519,6 +3638,7 @@
           </w:p>
         </w:tc>
         <w:tc>
+          <w:tcPr/>
           <w:p>
             <w:pPr>
               <w:pStyle w:val="Compact"/>
@@ -3532,6 +3652,7 @@
       </w:tr>
       <w:tr>
         <w:tc>
+          <w:tcPr/>
           <w:p>
             <w:pPr>
               <w:pStyle w:val="Compact"/>
@@ -3543,6 +3664,7 @@
           </w:p>
         </w:tc>
         <w:tc>
+          <w:tcPr/>
           <w:p>
             <w:pPr>
               <w:pStyle w:val="Compact"/>
@@ -3554,6 +3676,7 @@
           </w:p>
         </w:tc>
         <w:tc>
+          <w:tcPr/>
           <w:p>
             <w:pPr>
               <w:pStyle w:val="Compact"/>
@@ -3567,6 +3690,7 @@
       </w:tr>
       <w:tr>
         <w:tc>
+          <w:tcPr/>
           <w:p>
             <w:pPr>
               <w:pStyle w:val="Compact"/>
@@ -3578,6 +3702,7 @@
           </w:p>
         </w:tc>
         <w:tc>
+          <w:tcPr/>
           <w:p>
             <w:pPr>
               <w:pStyle w:val="Compact"/>
@@ -3589,6 +3714,7 @@
           </w:p>
         </w:tc>
         <w:tc>
+          <w:tcPr/>
           <w:p>
             <w:pPr>
               <w:pStyle w:val="Compact"/>
@@ -3602,6 +3728,7 @@
       </w:tr>
       <w:tr>
         <w:tc>
+          <w:tcPr/>
           <w:p>
             <w:pPr>
               <w:pStyle w:val="Compact"/>
@@ -3613,6 +3740,7 @@
           </w:p>
         </w:tc>
         <w:tc>
+          <w:tcPr/>
           <w:p>
             <w:pPr>
               <w:pStyle w:val="Compact"/>
@@ -3624,6 +3752,7 @@
           </w:p>
         </w:tc>
         <w:tc>
+          <w:tcPr/>
           <w:p>
             <w:pPr>
               <w:pStyle w:val="Compact"/>
@@ -3636,21 +3765,22 @@
         </w:tc>
       </w:tr>
     </w:tbl>
+    <w:bookmarkEnd w:id="39"/>
+    <w:bookmarkStart w:id="40" w:name="safety-requirements"/>
     <w:p>
       <w:pPr>
         <w:pStyle w:val="Heading1"/>
       </w:pPr>
-      <w:bookmarkStart w:id="36" w:name="safety-requirements"/>
       <w:r>
         <w:t xml:space="preserve">9. Safety requirements</w:t>
       </w:r>
-      <w:bookmarkEnd w:id="36"/>
     </w:p>
     <w:tbl>
       <w:tblPr>
         <w:tblStyle w:val="Table"/>
-        <w:tblW w:type="pct" w:w="5000.0"/>
-        <w:tblLook w:firstRow="1"/>
+        <w:tblW w:type="pct" w:w="5000"/>
+        <w:tblLook w:firstRow="1" w:lastRow="0" w:firstColumn="0" w:lastColumn="0" w:noHBand="0" w:noVBand="0" w:val="0020"/>
+        <w:jc w:val="start"/>
       </w:tblPr>
       <w:tblGrid>
         <w:gridCol w:w="554"/>
@@ -3661,15 +3791,10 @@
       </w:tblGrid>
       <w:tr>
         <w:trPr>
-          <w:cnfStyle w:firstRow="1"/>
+          <w:tblHeader w:val="true"/>
         </w:trPr>
         <w:tc>
-          <w:tcPr>
-            <w:tcBorders>
-              <w:bottom w:val="single"/>
-            </w:tcBorders>
-            <w:vAlign w:val="bottom"/>
-          </w:tcPr>
+          <w:tcPr/>
           <w:p>
             <w:pPr>
               <w:pStyle w:val="Compact"/>
@@ -3681,12 +3806,7 @@
           </w:p>
         </w:tc>
         <w:tc>
-          <w:tcPr>
-            <w:tcBorders>
-              <w:bottom w:val="single"/>
-            </w:tcBorders>
-            <w:vAlign w:val="bottom"/>
-          </w:tcPr>
+          <w:tcPr/>
           <w:p>
             <w:pPr>
               <w:pStyle w:val="Compact"/>
@@ -3698,12 +3818,7 @@
           </w:p>
         </w:tc>
         <w:tc>
-          <w:tcPr>
-            <w:tcBorders>
-              <w:bottom w:val="single"/>
-            </w:tcBorders>
-            <w:vAlign w:val="bottom"/>
-          </w:tcPr>
+          <w:tcPr/>
           <w:p>
             <w:pPr>
               <w:pStyle w:val="Compact"/>
@@ -3715,12 +3830,7 @@
           </w:p>
         </w:tc>
         <w:tc>
-          <w:tcPr>
-            <w:tcBorders>
-              <w:bottom w:val="single"/>
-            </w:tcBorders>
-            <w:vAlign w:val="bottom"/>
-          </w:tcPr>
+          <w:tcPr/>
           <w:p>
             <w:pPr>
               <w:pStyle w:val="Compact"/>
@@ -3732,12 +3842,7 @@
           </w:p>
         </w:tc>
         <w:tc>
-          <w:tcPr>
-            <w:tcBorders>
-              <w:bottom w:val="single"/>
-            </w:tcBorders>
-            <w:vAlign w:val="bottom"/>
-          </w:tcPr>
+          <w:tcPr/>
           <w:p>
             <w:pPr>
               <w:pStyle w:val="Compact"/>
@@ -3751,6 +3856,7 @@
       </w:tr>
       <w:tr>
         <w:tc>
+          <w:tcPr/>
           <w:p>
             <w:pPr>
               <w:pStyle w:val="Compact"/>
@@ -3762,6 +3868,7 @@
           </w:p>
         </w:tc>
         <w:tc>
+          <w:tcPr/>
           <w:p>
             <w:pPr>
               <w:pStyle w:val="Compact"/>
@@ -3773,6 +3880,7 @@
           </w:p>
         </w:tc>
         <w:tc>
+          <w:tcPr/>
           <w:p>
             <w:pPr>
               <w:pStyle w:val="Compact"/>
@@ -3784,6 +3892,7 @@
           </w:p>
         </w:tc>
         <w:tc>
+          <w:tcPr/>
           <w:p>
             <w:pPr>
               <w:pStyle w:val="Compact"/>
@@ -3795,6 +3904,7 @@
           </w:p>
         </w:tc>
         <w:tc>
+          <w:tcPr/>
           <w:p>
             <w:pPr>
               <w:pStyle w:val="Compact"/>
@@ -3808,6 +3918,7 @@
       </w:tr>
       <w:tr>
         <w:tc>
+          <w:tcPr/>
           <w:p>
             <w:pPr>
               <w:pStyle w:val="Compact"/>
@@ -3819,6 +3930,7 @@
           </w:p>
         </w:tc>
         <w:tc>
+          <w:tcPr/>
           <w:p>
             <w:pPr>
               <w:pStyle w:val="Compact"/>
@@ -3830,6 +3942,7 @@
           </w:p>
         </w:tc>
         <w:tc>
+          <w:tcPr/>
           <w:p>
             <w:pPr>
               <w:pStyle w:val="Compact"/>
@@ -3841,6 +3954,7 @@
           </w:p>
         </w:tc>
         <w:tc>
+          <w:tcPr/>
           <w:p>
             <w:pPr>
               <w:pStyle w:val="Compact"/>
@@ -3852,6 +3966,7 @@
           </w:p>
         </w:tc>
         <w:tc>
+          <w:tcPr/>
           <w:p>
             <w:pPr>
               <w:pStyle w:val="Compact"/>
@@ -3865,6 +3980,7 @@
       </w:tr>
       <w:tr>
         <w:tc>
+          <w:tcPr/>
           <w:p>
             <w:pPr>
               <w:pStyle w:val="Compact"/>
@@ -3876,6 +3992,7 @@
           </w:p>
         </w:tc>
         <w:tc>
+          <w:tcPr/>
           <w:p>
             <w:pPr>
               <w:pStyle w:val="Compact"/>
@@ -3887,6 +4004,7 @@
           </w:p>
         </w:tc>
         <w:tc>
+          <w:tcPr/>
           <w:p>
             <w:pPr>
               <w:pStyle w:val="Compact"/>
@@ -3898,6 +4016,7 @@
           </w:p>
         </w:tc>
         <w:tc>
+          <w:tcPr/>
           <w:p>
             <w:pPr>
               <w:pStyle w:val="Compact"/>
@@ -3909,6 +4028,7 @@
           </w:p>
         </w:tc>
         <w:tc>
+          <w:tcPr/>
           <w:p>
             <w:pPr>
               <w:pStyle w:val="Compact"/>
@@ -3922,6 +4042,7 @@
       </w:tr>
       <w:tr>
         <w:tc>
+          <w:tcPr/>
           <w:p>
             <w:pPr>
               <w:pStyle w:val="Compact"/>
@@ -3933,6 +4054,7 @@
           </w:p>
         </w:tc>
         <w:tc>
+          <w:tcPr/>
           <w:p>
             <w:pPr>
               <w:pStyle w:val="Compact"/>
@@ -3944,6 +4066,7 @@
           </w:p>
         </w:tc>
         <w:tc>
+          <w:tcPr/>
           <w:p>
             <w:pPr>
               <w:pStyle w:val="Compact"/>
@@ -3955,6 +4078,7 @@
           </w:p>
         </w:tc>
         <w:tc>
+          <w:tcPr/>
           <w:p>
             <w:pPr>
               <w:pStyle w:val="Compact"/>
@@ -3966,6 +4090,7 @@
           </w:p>
         </w:tc>
         <w:tc>
+          <w:tcPr/>
           <w:p>
             <w:pPr>
               <w:pStyle w:val="Compact"/>
@@ -3999,13 +4124,50 @@
               <w:t xml:space="preserve">FreshnessTest.kt</w:t>
             </w:r>
             <w:r>
-              <w:t xml:space="preserve">, not yet run on a device</w:t>
-            </w:r>
-          </w:p>
-        </w:tc>
-      </w:tr>
-      <w:tr>
-        <w:tc>
+              <w:t xml:space="preserve">, the instrumented</w:t>
+            </w:r>
+            <w:r>
+              <w:t xml:space="preserve"> </w:t>
+            </w:r>
+            <w:r>
+              <w:rPr>
+                <w:rStyle w:val="VerbatimChar"/>
+              </w:rPr>
+              <w:t xml:space="preserve">ClusterSmokeTest.kt</w:t>
+            </w:r>
+            <w:r>
+              <w:t xml:space="preserve"> </w:t>
+            </w:r>
+            <w:r>
+              <w:t xml:space="preserve">on the Android 16 car emulator (suite check</w:t>
+            </w:r>
+            <w:r>
+              <w:t xml:space="preserve"> </w:t>
+            </w:r>
+            <w:r>
+              <w:rPr>
+                <w:rStyle w:val="VerbatimChar"/>
+              </w:rPr>
+              <w:t xml:space="preserve">compose-ui</w:t>
+            </w:r>
+            <w:r>
+              <w:t xml:space="preserve">), and captures 1.4 s after the broker was stopped and after it returned, with no action on the app (</w:t>
+            </w:r>
+            <w:r>
+              <w:rPr>
+                <w:rStyle w:val="VerbatimChar"/>
+              </w:rPr>
+              <w:t xml:space="preserve">docs/evidence/screens/20261002-compose-*</w:t>
+            </w:r>
+            <w:r>
+              <w:t xml:space="preserve">)</w:t>
+            </w:r>
+          </w:p>
+        </w:tc>
+      </w:tr>
+      <w:tr>
+        <w:tc>
+          <w:tcPr/>
           <w:p>
             <w:pPr>
               <w:pStyle w:val="Compact"/>
@@ -4017,6 +4179,7 @@
           </w:p>
         </w:tc>
         <w:tc>
+          <w:tcPr/>
           <w:p>
             <w:pPr>
               <w:pStyle w:val="Compact"/>
@@ -4028,6 +4191,7 @@
           </w:p>
         </w:tc>
         <w:tc>
+          <w:tcPr/>
           <w:p>
             <w:pPr>
               <w:pStyle w:val="Compact"/>
@@ -4039,6 +4203,7 @@
           </w:p>
         </w:tc>
         <w:tc>
+          <w:tcPr/>
           <w:p>
             <w:pPr>
               <w:pStyle w:val="Compact"/>
@@ -4050,6 +4215,7 @@
           </w:p>
         </w:tc>
         <w:tc>
+          <w:tcPr/>
           <w:p>
             <w:pPr>
               <w:pStyle w:val="Compact"/>
@@ -4113,7 +4279,7 @@
               <w:t xml:space="preserve">VssClient.kt</w:t>
             </w:r>
             <w:r>
-              <w:t xml:space="preserve">; providers republish them every tick (</w:t>
+              <w:t xml:space="preserve">, all eight in both since 2 October; providers republish them every tick (</w:t>
             </w:r>
             <w:r>
               <w:rPr>
@@ -4129,6 +4295,7 @@
       </w:tr>
       <w:tr>
         <w:tc>
+          <w:tcPr/>
           <w:p>
             <w:pPr>
               <w:pStyle w:val="Compact"/>
@@ -4140,6 +4307,7 @@
           </w:p>
         </w:tc>
         <w:tc>
+          <w:tcPr/>
           <w:p>
             <w:pPr>
               <w:pStyle w:val="Compact"/>
@@ -4151,6 +4319,7 @@
           </w:p>
         </w:tc>
         <w:tc>
+          <w:tcPr/>
           <w:p>
             <w:pPr>
               <w:pStyle w:val="Compact"/>
@@ -4162,6 +4331,7 @@
           </w:p>
         </w:tc>
         <w:tc>
+          <w:tcPr/>
           <w:p>
             <w:pPr>
               <w:pStyle w:val="Compact"/>
@@ -4173,6 +4343,7 @@
           </w:p>
         </w:tc>
         <w:tc>
+          <w:tcPr/>
           <w:p>
             <w:pPr>
               <w:pStyle w:val="Compact"/>
@@ -4186,6 +4357,7 @@
       </w:tr>
       <w:tr>
         <w:tc>
+          <w:tcPr/>
           <w:p>
             <w:pPr>
               <w:pStyle w:val="Compact"/>
@@ -4197,6 +4369,7 @@
           </w:p>
         </w:tc>
         <w:tc>
+          <w:tcPr/>
           <w:p>
             <w:pPr>
               <w:pStyle w:val="Compact"/>
@@ -4208,6 +4381,7 @@
           </w:p>
         </w:tc>
         <w:tc>
+          <w:tcPr/>
           <w:p>
             <w:pPr>
               <w:pStyle w:val="Compact"/>
@@ -4219,6 +4393,7 @@
           </w:p>
         </w:tc>
         <w:tc>
+          <w:tcPr/>
           <w:p>
             <w:pPr>
               <w:pStyle w:val="Compact"/>
@@ -4230,6 +4405,7 @@
           </w:p>
         </w:tc>
         <w:tc>
+          <w:tcPr/>
           <w:p>
             <w:pPr>
               <w:pStyle w:val="Compact"/>
@@ -4258,6 +4434,7 @@
       </w:tr>
       <w:tr>
         <w:tc>
+          <w:tcPr/>
           <w:p>
             <w:pPr>
               <w:pStyle w:val="Compact"/>
@@ -4269,6 +4446,7 @@
           </w:p>
         </w:tc>
         <w:tc>
+          <w:tcPr/>
           <w:p>
             <w:pPr>
               <w:pStyle w:val="Compact"/>
@@ -4280,6 +4458,7 @@
           </w:p>
         </w:tc>
         <w:tc>
+          <w:tcPr/>
           <w:p>
             <w:pPr>
               <w:pStyle w:val="Compact"/>
@@ -4291,6 +4470,7 @@
           </w:p>
         </w:tc>
         <w:tc>
+          <w:tcPr/>
           <w:p>
             <w:pPr>
               <w:pStyle w:val="Compact"/>
@@ -4302,6 +4482,7 @@
           </w:p>
         </w:tc>
         <w:tc>
+          <w:tcPr/>
           <w:p>
             <w:pPr>
               <w:pStyle w:val="Compact"/>
@@ -4315,6 +4496,7 @@
       </w:tr>
       <w:tr>
         <w:tc>
+          <w:tcPr/>
           <w:p>
             <w:pPr>
               <w:pStyle w:val="Compact"/>
@@ -4326,6 +4508,7 @@
           </w:p>
         </w:tc>
         <w:tc>
+          <w:tcPr/>
           <w:p>
             <w:pPr>
               <w:pStyle w:val="Compact"/>
@@ -4337,6 +4520,7 @@
           </w:p>
         </w:tc>
         <w:tc>
+          <w:tcPr/>
           <w:p>
             <w:pPr>
               <w:pStyle w:val="Compact"/>
@@ -4348,6 +4532,7 @@
           </w:p>
         </w:tc>
         <w:tc>
+          <w:tcPr/>
           <w:p>
             <w:pPr>
               <w:pStyle w:val="Compact"/>
@@ -4359,6 +4544,7 @@
           </w:p>
         </w:tc>
         <w:tc>
+          <w:tcPr/>
           <w:p>
             <w:pPr>
               <w:pStyle w:val="Compact"/>
@@ -4384,6 +4570,7 @@
       </w:tr>
       <w:tr>
         <w:tc>
+          <w:tcPr/>
           <w:p>
             <w:pPr>
               <w:pStyle w:val="Compact"/>
@@ -4395,6 +4582,7 @@
           </w:p>
         </w:tc>
         <w:tc>
+          <w:tcPr/>
           <w:p>
             <w:pPr>
               <w:pStyle w:val="Compact"/>
@@ -4406,6 +4594,7 @@
           </w:p>
         </w:tc>
         <w:tc>
+          <w:tcPr/>
           <w:p>
             <w:pPr>
               <w:pStyle w:val="Compact"/>
@@ -4417,6 +4606,7 @@
           </w:p>
         </w:tc>
         <w:tc>
+          <w:tcPr/>
           <w:p>
             <w:pPr>
               <w:pStyle w:val="Compact"/>
@@ -4428,6 +4618,7 @@
           </w:p>
         </w:tc>
         <w:tc>
+          <w:tcPr/>
           <w:p>
             <w:pPr>
               <w:pStyle w:val="Compact"/>
@@ -4441,6 +4632,7 @@
       </w:tr>
       <w:tr>
         <w:tc>
+          <w:tcPr/>
           <w:p>
             <w:pPr>
               <w:pStyle w:val="Compact"/>
@@ -4452,6 +4644,7 @@
           </w:p>
         </w:tc>
         <w:tc>
+          <w:tcPr/>
           <w:p>
             <w:pPr>
               <w:pStyle w:val="Compact"/>
@@ -4463,6 +4656,7 @@
           </w:p>
         </w:tc>
         <w:tc>
+          <w:tcPr/>
           <w:p>
             <w:pPr>
               <w:pStyle w:val="Compact"/>
@@ -4474,6 +4668,7 @@
           </w:p>
         </w:tc>
         <w:tc>
+          <w:tcPr/>
           <w:p>
             <w:pPr>
               <w:pStyle w:val="Compact"/>
@@ -4485,6 +4680,7 @@
           </w:p>
         </w:tc>
         <w:tc>
+          <w:tcPr/>
           <w:p>
             <w:pPr>
               <w:pStyle w:val="Compact"/>
@@ -4497,15 +4693,15 @@
         </w:tc>
       </w:tr>
     </w:tbl>
+    <w:bookmarkEnd w:id="40"/>
+    <w:bookmarkStart w:id="41" w:name="verification-and-traceability"/>
     <w:p>
       <w:pPr>
         <w:pStyle w:val="Heading1"/>
       </w:pPr>
-      <w:bookmarkStart w:id="37" w:name="verification-and-traceability"/>
       <w:r>
         <w:t xml:space="preserve">10. Verification and traceability</w:t>
       </w:r>
-      <w:bookmarkEnd w:id="37"/>
     </w:p>
     <w:p>
       <w:pPr>
@@ -4515,6 +4711,7 @@
         <w:t xml:space="preserve">Safety requirements are traced to user stories US-13, US-15 and US-17 in PULSE-StRS-001 and to their verification in PULSE-RTM-001. Test cases for SR-4, SR-5 and SR-6 are written in sprint 2 as part of the regression suite so that each demo re-runs them.</w:t>
       </w:r>
     </w:p>
+    <w:bookmarkEnd w:id="41"/>
     <w:sectPr/>
   </w:body>
 </w:document>
@@ -4546,17 +4743,14 @@
 <file path=word/numbering.xml><?xml version="1.0" encoding="utf-8"?>
 <w:numbering xmlns:w="http://schemas.openxmlformats.org/wordprocessingml/2006/main">
   <w:abstractNum w:abstractNumId="990">
-    <w:nsid w:val="170cd2de"/>
+    <w:nsid w:val="A990"/>
     <w:multiLevelType w:val="multilevel"/>
     <w:lvl w:ilvl="0">
       <w:numFmt w:val="bullet"/>
       <w:lvlText w:val=" "/>
       <w:lvlJc w:val="left"/>
       <w:pPr>
-        <w:tabs>
-          <w:tab w:val="num" w:pos="0"/>
-        </w:tabs>
-        <w:ind w:left="480" w:hanging="480"/>
+        <w:ind w:left="720" w:hanging="480"/>
       </w:pPr>
     </w:lvl>
     <w:lvl w:ilvl="1">
@@ -4564,10 +4758,7 @@
       <w:lvlText w:val=" "/>
       <w:lvlJc w:val="left"/>
       <w:pPr>
-        <w:tabs>
-          <w:tab w:val="num" w:pos="720"/>
-        </w:tabs>
-        <w:ind w:left="1200" w:hanging="480"/>
+        <w:ind w:left="1440" w:hanging="480"/>
       </w:pPr>
     </w:lvl>
     <w:lvl w:ilvl="2">
@@ -4575,10 +4766,7 @@
       <w:lvlText w:val=" "/>
       <w:lvlJc w:val="left"/>
       <w:pPr>
-        <w:tabs>
-          <w:tab w:val="num" w:pos="1440"/>
-        </w:tabs>
-        <w:ind w:left="1920" w:hanging="480"/>
+        <w:ind w:left="2160" w:hanging="480"/>
       </w:pPr>
     </w:lvl>
     <w:lvl w:ilvl="3">
@@ -4586,10 +4774,7 @@
       <w:lvlText w:val=" "/>
       <w:lvlJc w:val="left"/>
       <w:pPr>
-        <w:tabs>
-          <w:tab w:val="num" w:pos="2160"/>
-        </w:tabs>
-        <w:ind w:left="2640" w:hanging="480"/>
+        <w:ind w:left="2880" w:hanging="480"/>
       </w:pPr>
     </w:lvl>
     <w:lvl w:ilvl="4">
@@ -4597,10 +4782,7 @@
       <w:lvlText w:val=" "/>
       <w:lvlJc w:val="left"/>
       <w:pPr>
-        <w:tabs>
-          <w:tab w:val="num" w:pos="2880"/>
-        </w:tabs>
-        <w:ind w:left="3360" w:hanging="480"/>
+        <w:ind w:left="3600" w:hanging="480"/>
       </w:pPr>
     </w:lvl>
     <w:lvl w:ilvl="5">
@@ -4608,10 +4790,7 @@
       <w:lvlText w:val=" "/>
       <w:lvlJc w:val="left"/>
       <w:pPr>
-        <w:tabs>
-          <w:tab w:val="num" w:pos="3600"/>
-        </w:tabs>
-        <w:ind w:left="4080" w:hanging="480"/>
+        <w:ind w:left="4320" w:hanging="480"/>
       </w:pPr>
     </w:lvl>
     <w:lvl w:ilvl="6">
@@ -4619,10 +4798,7 @@
       <w:lvlText w:val=" "/>
       <w:lvlJc w:val="left"/>
       <w:pPr>
-        <w:tabs>
-          <w:tab w:val="num" w:pos="4320"/>
-        </w:tabs>
-        <w:ind w:left="4800" w:hanging="480"/>
+        <w:ind w:left="5040" w:hanging="480"/>
       </w:pPr>
     </w:lvl>
     <w:lvl w:ilvl="7">
@@ -4630,10 +4806,7 @@
       <w:lvlText w:val=" "/>
       <w:lvlJc w:val="left"/>
       <w:pPr>
-        <w:tabs>
-          <w:tab w:val="num" w:pos="5040"/>
-        </w:tabs>
-        <w:ind w:left="5520" w:hanging="480"/>
+        <w:ind w:left="5760" w:hanging="480"/>
       </w:pPr>
     </w:lvl>
     <w:lvl w:ilvl="8">
@@ -4641,128 +4814,19 @@
       <w:lvlText w:val=" "/>
       <w:lvlJc w:val="left"/>
       <w:pPr>
-        <w:tabs>
-          <w:tab w:val="num" w:pos="5760"/>
-        </w:tabs>
-        <w:ind w:left="6240" w:hanging="480"/>
-      </w:pPr>
-    </w:lvl>
-  </w:abstractNum>
-  <w:abstractNum w:abstractNumId="990">
-    <w:nsid w:val="2c1ae401"/>
-    <w:multiLevelType w:val="multilevel"/>
-    <w:lvl w:ilvl="0">
-      <w:numFmt w:val="bullet"/>
-      <w:lvlText w:val=" "/>
-      <w:lvlJc w:val="left"/>
-      <w:pPr>
-        <w:tabs>
-          <w:tab w:val="num" w:pos="0"/>
-        </w:tabs>
-        <w:ind w:left="480" w:hanging="480"/>
-      </w:pPr>
-    </w:lvl>
-    <w:lvl w:ilvl="1">
-      <w:numFmt w:val="bullet"/>
-      <w:lvlText w:val=" "/>
-      <w:lvlJc w:val="left"/>
-      <w:pPr>
-        <w:tabs>
-          <w:tab w:val="num" w:pos="720"/>
-        </w:tabs>
-        <w:ind w:left="1200" w:hanging="480"/>
-      </w:pPr>
-    </w:lvl>
-    <w:lvl w:ilvl="2">
-      <w:numFmt w:val="bullet"/>
-      <w:lvlText w:val=" "/>
-      <w:lvlJc w:val="left"/>
-      <w:pPr>
-        <w:tabs>
-          <w:tab w:val="num" w:pos="1440"/>
-        </w:tabs>
-        <w:ind w:left="1920" w:hanging="480"/>
-      </w:pPr>
-    </w:lvl>
-    <w:lvl w:ilvl="3">
-      <w:numFmt w:val="bullet"/>
-      <w:lvlText w:val=" "/>
-      <w:lvlJc w:val="left"/>
-      <w:pPr>
-        <w:tabs>
-          <w:tab w:val="num" w:pos="2160"/>
-        </w:tabs>
-        <w:ind w:left="2640" w:hanging="480"/>
-      </w:pPr>
-    </w:lvl>
-    <w:lvl w:ilvl="4">
-      <w:numFmt w:val="bullet"/>
-      <w:lvlText w:val=" "/>
-      <w:lvlJc w:val="left"/>
-      <w:pPr>
-        <w:tabs>
-          <w:tab w:val="num" w:pos="2880"/>
-        </w:tabs>
-        <w:ind w:left="3360" w:hanging="480"/>
-      </w:pPr>
-    </w:lvl>
-    <w:lvl w:ilvl="5">
-      <w:numFmt w:val="bullet"/>
-      <w:lvlText w:val=" "/>
-      <w:lvlJc w:val="left"/>
-      <w:pPr>
-        <w:tabs>
-          <w:tab w:val="num" w:pos="3600"/>
-        </w:tabs>
-        <w:ind w:left="4080" w:hanging="480"/>
-      </w:pPr>
-    </w:lvl>
-    <w:lvl w:ilvl="6">
-      <w:numFmt w:val="bullet"/>
-      <w:lvlText w:val=" "/>
-      <w:lvlJc w:val="left"/>
-      <w:pPr>
-        <w:tabs>
-          <w:tab w:val="num" w:pos="4320"/>
-        </w:tabs>
-        <w:ind w:left="4800" w:hanging="480"/>
-      </w:pPr>
-    </w:lvl>
-    <w:lvl w:ilvl="7">
-      <w:numFmt w:val="bullet"/>
-      <w:lvlText w:val=" "/>
-      <w:lvlJc w:val="left"/>
-      <w:pPr>
-        <w:tabs>
-          <w:tab w:val="num" w:pos="5040"/>
-        </w:tabs>
-        <w:ind w:left="5520" w:hanging="480"/>
-      </w:pPr>
-    </w:lvl>
-    <w:lvl w:ilvl="8">
-      <w:numFmt w:val="bullet"/>
-      <w:lvlText w:val=" "/>
-      <w:lvlJc w:val="left"/>
-      <w:pPr>
-        <w:tabs>
-          <w:tab w:val="num" w:pos="5760"/>
-        </w:tabs>
-        <w:ind w:left="6240" w:hanging="480"/>
+        <w:ind w:left="6480" w:hanging="480"/>
       </w:pPr>
     </w:lvl>
   </w:abstractNum>
   <w:abstractNum w:abstractNumId="991">
-    <w:nsid w:val="ea454b4c"/>
+    <w:nsid w:val="A991"/>
     <w:multiLevelType w:val="multilevel"/>
     <w:lvl w:ilvl="0">
       <w:numFmt w:val="bullet"/>
       <w:lvlText w:val="•"/>
       <w:lvlJc w:val="left"/>
       <w:pPr>
-        <w:tabs>
-          <w:tab w:val="num" w:pos="0"/>
-        </w:tabs>
-        <w:ind w:left="480" w:hanging="480"/>
+        <w:ind w:left="720" w:hanging="480"/>
       </w:pPr>
     </w:lvl>
     <w:lvl w:ilvl="1">
@@ -4770,10 +4834,7 @@
       <w:lvlText w:val="–"/>
       <w:lvlJc w:val="left"/>
       <w:pPr>
-        <w:tabs>
-          <w:tab w:val="num" w:pos="720"/>
-        </w:tabs>
-        <w:ind w:left="1200" w:hanging="480"/>
+        <w:ind w:left="1440" w:hanging="480"/>
       </w:pPr>
     </w:lvl>
     <w:lvl w:ilvl="2">
@@ -4781,10 +4842,7 @@
       <w:lvlText w:val="•"/>
       <w:lvlJc w:val="left"/>
       <w:pPr>
-        <w:tabs>
-          <w:tab w:val="num" w:pos="1440"/>
-        </w:tabs>
-        <w:ind w:left="1920" w:hanging="480"/>
+        <w:ind w:left="2160" w:hanging="480"/>
       </w:pPr>
     </w:lvl>
     <w:lvl w:ilvl="3">
@@ -4792,10 +4850,7 @@
       <w:lvlText w:val="–"/>
       <w:lvlJc w:val="left"/>
       <w:pPr>
-        <w:tabs>
-          <w:tab w:val="num" w:pos="2160"/>
-        </w:tabs>
-        <w:ind w:left="2640" w:hanging="480"/>
+        <w:ind w:left="2880" w:hanging="480"/>
       </w:pPr>
     </w:lvl>
     <w:lvl w:ilvl="4">
@@ -4803,10 +4858,7 @@
       <w:lvlText w:val="•"/>
       <w:lvlJc w:val="left"/>
       <w:pPr>
-        <w:tabs>
-          <w:tab w:val="num" w:pos="2880"/>
-        </w:tabs>
-        <w:ind w:left="3360" w:hanging="480"/>
+        <w:ind w:left="3600" w:hanging="480"/>
       </w:pPr>
     </w:lvl>
     <w:lvl w:ilvl="5">
@@ -4814,10 +4866,7 @@
       <w:lvlText w:val="–"/>
       <w:lvlJc w:val="left"/>
       <w:pPr>
-        <w:tabs>
-          <w:tab w:val="num" w:pos="3600"/>
-        </w:tabs>
-        <w:ind w:left="4080" w:hanging="480"/>
+        <w:ind w:left="4320" w:hanging="480"/>
       </w:pPr>
     </w:lvl>
     <w:lvl w:ilvl="6">
@@ -4825,10 +4874,7 @@
       <w:lvlText w:val="•"/>
       <w:lvlJc w:val="left"/>
       <w:pPr>
-        <w:tabs>
-          <w:tab w:val="num" w:pos="4320"/>
-        </w:tabs>
-        <w:ind w:left="4800" w:hanging="480"/>
+        <w:ind w:left="5040" w:hanging="480"/>
       </w:pPr>
     </w:lvl>
     <w:lvl w:ilvl="7">
@@ -4836,10 +4882,7 @@
       <w:lvlText w:val="–"/>
       <w:lvlJc w:val="left"/>
       <w:pPr>
-        <w:tabs>
-          <w:tab w:val="num" w:pos="5040"/>
-        </w:tabs>
-        <w:ind w:left="5520" w:hanging="480"/>
+        <w:ind w:left="5760" w:hanging="480"/>
       </w:pPr>
     </w:lvl>
     <w:lvl w:ilvl="8">
@@ -4847,16 +4890,10 @@
       <w:lvlText w:val="•"/>
       <w:lvlJc w:val="left"/>
       <w:pPr>
-        <w:tabs>
-          <w:tab w:val="num" w:pos="5760"/>
-        </w:tabs>
-        <w:ind w:left="6240" w:hanging="480"/>
+        <w:ind w:left="6480" w:hanging="480"/>
       </w:pPr>
     </w:lvl>
   </w:abstractNum>
-  <w:num w:numId="1000">
-    <w:abstractNumId w:val="990"/>
-  </w:num>
   <w:num w:numId="1000">
     <w:abstractNumId w:val="990"/>
   </w:num>
@@ -4871,10 +4908,10 @@
   <w:docDefaults>
     <w:rPrDefault>
       <w:rPr>
-        <w:rFonts w:asciiTheme="minorHAnsi" w:eastAsiaTheme="minorHAnsi" w:hAnsiTheme="minorHAnsi" w:cstheme="minorBidi"/>
+        <w:rFonts w:asciiTheme="minorHAnsi" w:cstheme="minorBidi" w:eastAsiaTheme="minorHAnsi" w:hAnsiTheme="minorHAnsi"/>
         <w:sz w:val="24"/>
         <w:szCs w:val="24"/>
-        <w:lang w:val="en-US" w:eastAsia="en-US" w:bidi="ar-SA"/>
+        <w:lang w:bidi="ar-SA" w:eastAsia="en-US" w:val="en-US"/>
       </w:rPr>
     </w:rPrDefault>
     <w:pPrDefault>
@@ -4883,35 +4920,35 @@
       </w:pPr>
     </w:pPrDefault>
   </w:docDefaults>
-  <w:latentStyles w:defLockedState="0" w:defUIPriority="0" w:defSemiHidden="0" w:defUnhideWhenUsed="0" w:defQFormat="0" w:count="276"/>
-  <w:style w:type="paragraph" w:default="1" w:styleId="Normal">
+  <w:latentStyles w:count="276" w:defLockedState="0" w:defQFormat="0" w:defSemiHidden="0" w:defUIPriority="0" w:defUnhideWhenUsed="0"/>
+  <w:style w:default="1" w:styleId="Normal" w:type="paragraph">
     <w:name w:val="Normal"/>
     <w:qFormat/>
   </w:style>
-  <w:style w:type="paragraph" w:styleId="BodyText">
+  <w:style w:styleId="BodyText" w:type="paragraph">
     <w:name w:val="Body Text"/>
     <w:basedOn w:val="Normal"/>
     <w:link w:val="BodyTextChar"/>
     <w:pPr>
-      <w:spacing w:before="180" w:after="180"/>
+      <w:spacing w:after="180" w:before="180"/>
     </w:pPr>
     <w:qFormat/>
   </w:style>
-  <w:style w:type="paragraph" w:customStyle="1" w:styleId="FirstParagraph">
+  <w:style w:customStyle="1" w:styleId="FirstParagraph" w:type="paragraph">
     <w:name w:val="First Paragraph"/>
     <w:basedOn w:val="BodyText"/>
     <w:next w:val="BodyText"/>
     <w:qFormat/>
   </w:style>
-  <w:style w:type="paragraph" w:customStyle="1" w:styleId="Compact">
+  <w:style w:customStyle="1" w:styleId="Compact" w:type="paragraph">
     <w:name w:val="Compact"/>
     <w:basedOn w:val="BodyText"/>
     <w:qFormat/>
     <w:pPr>
-      <w:spacing w:before="36" w:after="36"/>
+      <w:spacing w:after="36" w:before="36"/>
     </w:pPr>
   </w:style>
-  <w:style w:type="paragraph" w:styleId="Title">
+  <w:style w:styleId="Title" w:type="paragraph">
     <w:name w:val="Title"/>
     <w:basedOn w:val="Normal"/>
     <w:next w:val="BodyText"/>
@@ -4919,19 +4956,19 @@
     <w:pPr>
       <w:keepNext/>
       <w:keepLines/>
-      <w:spacing w:before="480" w:after="240"/>
+      <w:spacing w:after="240" w:before="480"/>
       <w:jc w:val="center"/>
     </w:pPr>
     <w:rPr>
-      <w:rFonts w:asciiTheme="majorHAnsi" w:eastAsiaTheme="majorEastAsia" w:hAnsiTheme="majorHAnsi" w:cstheme="majorBidi"/>
+      <w:rFonts w:asciiTheme="majorHAnsi" w:cstheme="majorBidi" w:eastAsiaTheme="majorEastAsia" w:hAnsiTheme="majorHAnsi"/>
       <w:b/>
       <w:bCs/>
-      <w:color w:val="345A8A" w:themeColor="accent1" w:themeShade="B5"/>
+      <w:color w:themeColor="accent1" w:themeShade="B5" w:val="345A8A"/>
       <w:sz w:val="36"/>
       <w:szCs w:val="36"/>
     </w:rPr>
   </w:style>
-  <w:style w:type="paragraph" w:styleId="Subtitle">
+  <w:style w:styleId="Subtitle" w:type="paragraph">
     <w:name w:val="Subtitle"/>
     <w:basedOn w:val="Title"/>
     <w:next w:val="BodyText"/>
@@ -4939,7 +4976,7 @@
     <w:pPr>
       <w:keepNext/>
       <w:keepLines/>
-      <w:spacing w:before="240" w:after="240"/>
+      <w:spacing w:after="240" w:before="240"/>
       <w:jc w:val="center"/>
     </w:pPr>
     <w:rPr>
@@ -4947,7 +4984,7 @@
       <w:szCs w:val="30"/>
     </w:rPr>
   </w:style>
-  <w:style w:type="paragraph" w:customStyle="1" w:styleId="Author">
+  <w:style w:customStyle="1" w:styleId="Author" w:type="paragraph">
     <w:name w:val="Author"/>
     <w:next w:val="BodyText"/>
     <w:qFormat/>
@@ -4957,7 +4994,7 @@
       <w:jc w:val="center"/>
     </w:pPr>
   </w:style>
-  <w:style w:type="paragraph" w:styleId="Date">
+  <w:style w:styleId="Date" w:type="paragraph">
     <w:name w:val="Date"/>
     <w:next w:val="BodyText"/>
     <w:qFormat/>
@@ -4967,7 +5004,26 @@
       <w:jc w:val="center"/>
     </w:pPr>
   </w:style>
-  <w:style w:type="paragraph" w:customStyle="1" w:styleId="Abstract">
+  <w:style w:customStyle="1" w:styleId="AbstractTitle" w:type="paragraph">
+    <w:name w:val="Abstract Title"/>
+    <w:basedOn w:val="Normal"/>
+    <w:next w:val="Abstract"/>
+    <w:qFormat/>
+    <w:pPr>
+      <w:keepNext/>
+      <w:keepLines/>
+      <w:jc w:val="center"/>
+      <w:spacing w:after="0" w:before="300"/>
+    </w:pPr>
+    <w:rPr>
+      <w:sz w:val="20"/>
+      <w:szCs w:val="20"/>
+      <w:b/>
+      <w:color w:val="345A8A"/>
+      &gt;
+    </w:rPr>
+  </w:style>
+  <w:style w:customStyle="1" w:styleId="Abstract" w:type="paragraph">
     <w:name w:val="Abstract"/>
     <w:basedOn w:val="Normal"/>
     <w:next w:val="BodyText"/>
@@ -4975,14 +5031,14 @@
     <w:pPr>
       <w:keepNext/>
       <w:keepLines/>
-      <w:spacing w:before="300" w:after="300"/>
+      <w:spacing w:after="300" w:before="100"/>
     </w:pPr>
     <w:rPr>
       <w:sz w:val="20"/>
       <w:szCs w:val="20"/>
     </w:rPr>
   </w:style>
-  <w:style w:type="paragraph" w:styleId="Bibliography">
+  <w:style w:styleId="Bibliography" w:type="paragraph">
     <w:name w:val="Bibliography"/>
     <w:basedOn w:val="Normal"/>
     <w:next w:val="Bibliography"/>
@@ -4990,7 +5046,7 @@
     <w:pPr/>
     <w:rPr/>
   </w:style>
-  <w:style w:type="paragraph" w:styleId="Heading1">
+  <w:style w:styleId="Heading1" w:type="paragraph">
     <w:name w:val="Heading 1"/>
     <w:basedOn w:val="Normal"/>
     <w:next w:val="BodyText"/>
@@ -4999,19 +5055,19 @@
     <w:pPr>
       <w:keepNext/>
       <w:keepLines/>
-      <w:spacing w:before="480" w:after="0"/>
+      <w:spacing w:after="0" w:before="480"/>
       <w:outlineLvl w:val="0"/>
     </w:pPr>
     <w:rPr>
-      <w:rFonts w:asciiTheme="majorHAnsi" w:eastAsiaTheme="majorEastAsia" w:hAnsiTheme="majorHAnsi" w:cstheme="majorBidi"/>
+      <w:rFonts w:asciiTheme="majorHAnsi" w:cstheme="majorBidi" w:eastAsiaTheme="majorEastAsia" w:hAnsiTheme="majorHAnsi"/>
       <w:b/>
       <w:bCs/>
-      <w:color w:val="345A8A" w:themeColor="accent1" w:themeShade="B5"/>
+      <w:color w:themeColor="accent1" w:val="4F81BD"/>
       <w:sz w:val="32"/>
       <w:szCs w:val="32"/>
     </w:rPr>
   </w:style>
-  <w:style w:type="paragraph" w:styleId="Heading2">
+  <w:style w:styleId="Heading2" w:type="paragraph">
     <w:name w:val="Heading 2"/>
     <w:basedOn w:val="Normal"/>
     <w:next w:val="BodyText"/>
@@ -5021,19 +5077,19 @@
     <w:pPr>
       <w:keepNext/>
       <w:keepLines/>
-      <w:spacing w:before="200" w:after="0"/>
+      <w:spacing w:after="0" w:before="200"/>
       <w:outlineLvl w:val="1"/>
     </w:pPr>
     <w:rPr>
-      <w:rFonts w:asciiTheme="majorHAnsi" w:eastAsiaTheme="majorEastAsia" w:hAnsiTheme="majorHAnsi" w:cstheme="majorBidi"/>
+      <w:rFonts w:asciiTheme="majorHAnsi" w:cstheme="majorBidi" w:eastAsiaTheme="majorEastAsia" w:hAnsiTheme="majorHAnsi"/>
       <w:b/>
       <w:bCs/>
-      <w:color w:val="4F81BD" w:themeColor="accent1"/>
-      <w:sz w:val="32"/>
-      <w:szCs w:val="32"/>
+      <w:color w:themeColor="accent1" w:val="4F81BD"/>
+      <w:sz w:val="28"/>
+      <w:szCs w:val="28"/>
     </w:rPr>
   </w:style>
-  <w:style w:type="paragraph" w:styleId="Heading3">
+  <w:style w:styleId="Heading3" w:type="paragraph">
     <w:name w:val="Heading 3"/>
     <w:basedOn w:val="Normal"/>
     <w:next w:val="BodyText"/>
@@ -5043,19 +5099,19 @@
     <w:pPr>
       <w:keepNext/>
       <w:keepLines/>
-      <w:spacing w:before="200" w:after="0"/>
+      <w:spacing w:after="0" w:before="200"/>
       <w:outlineLvl w:val="2"/>
     </w:pPr>
     <w:rPr>
-      <w:rFonts w:asciiTheme="majorHAnsi" w:eastAsiaTheme="majorEastAsia" w:hAnsiTheme="majorHAnsi" w:cstheme="majorBidi"/>
+      <w:rFonts w:asciiTheme="majorHAnsi" w:cstheme="majorBidi" w:eastAsiaTheme="majorEastAsia" w:hAnsiTheme="majorHAnsi"/>
       <w:b/>
       <w:bCs/>
-      <w:color w:val="4F81BD" w:themeColor="accent1"/>
-      <w:sz w:val="28"/>
-      <w:szCs w:val="28"/>
+      <w:color w:themeColor="accent1" w:val="4F81BD"/>
+      <w:sz w:val="24"/>
+      <w:szCs w:val="24"/>
     </w:rPr>
   </w:style>
-  <w:style w:type="paragraph" w:styleId="Heading4">
+  <w:style w:styleId="Heading4" w:type="paragraph">
     <w:name w:val="Heading 4"/>
     <w:basedOn w:val="Normal"/>
     <w:next w:val="BodyText"/>
@@ -5065,19 +5121,19 @@
     <w:pPr>
       <w:keepNext/>
       <w:keepLines/>
-      <w:spacing w:before="200" w:after="0"/>
+      <w:spacing w:after="0" w:before="200"/>
       <w:outlineLvl w:val="3"/>
     </w:pPr>
     <w:rPr>
-      <w:rFonts w:asciiTheme="majorHAnsi" w:eastAsiaTheme="majorEastAsia" w:hAnsiTheme="majorHAnsi" w:cstheme="majorBidi"/>
-      <w:b/>
+      <w:rFonts w:asciiTheme="majorHAnsi" w:cstheme="majorBidi" w:eastAsiaTheme="majorEastAsia" w:hAnsiTheme="majorHAnsi"/>
+      <w:i/>
       <w:bCs/>
-      <w:color w:val="4F81BD" w:themeColor="accent1"/>
+      <w:color w:themeColor="accent1" w:val="4F81BD"/>
       <w:sz w:val="24"/>
       <w:szCs w:val="24"/>
     </w:rPr>
   </w:style>
-  <w:style w:type="paragraph" w:styleId="Heading5">
+  <w:style w:styleId="Heading5" w:type="paragraph">
     <w:name w:val="Heading 5"/>
     <w:basedOn w:val="Normal"/>
     <w:next w:val="BodyText"/>
@@ -5087,19 +5143,18 @@
     <w:pPr>
       <w:keepNext/>
       <w:keepLines/>
-      <w:spacing w:before="200" w:after="0"/>
+      <w:spacing w:after="0" w:before="200"/>
       <w:outlineLvl w:val="4"/>
     </w:pPr>
     <w:rPr>
-      <w:rFonts w:asciiTheme="majorHAnsi" w:eastAsiaTheme="majorEastAsia" w:hAnsiTheme="majorHAnsi" w:cstheme="majorBidi"/>
-      <w:i/>
+      <w:rFonts w:asciiTheme="majorHAnsi" w:cstheme="majorBidi" w:eastAsiaTheme="majorEastAsia" w:hAnsiTheme="majorHAnsi"/>
       <w:iCs/>
-      <w:color w:val="4F81BD" w:themeColor="accent1"/>
+      <w:color w:themeColor="accent1" w:val="4F81BD"/>
       <w:sz w:val="24"/>
       <w:szCs w:val="24"/>
     </w:rPr>
   </w:style>
-  <w:style w:type="paragraph" w:styleId="Heading6">
+  <w:style w:styleId="Heading6" w:type="paragraph">
     <w:name w:val="Heading 6"/>
     <w:basedOn w:val="Normal"/>
     <w:next w:val="BodyText"/>
@@ -5109,17 +5164,17 @@
     <w:pPr>
       <w:keepNext/>
       <w:keepLines/>
-      <w:spacing w:before="200" w:after="0"/>
+      <w:spacing w:after="0" w:before="200"/>
       <w:outlineLvl w:val="5"/>
     </w:pPr>
     <w:rPr>
-      <w:rFonts w:asciiTheme="majorHAnsi" w:eastAsiaTheme="majorEastAsia" w:hAnsiTheme="majorHAnsi" w:cstheme="majorBidi"/>
-      <w:color w:val="4F81BD" w:themeColor="accent1"/>
+      <w:rFonts w:asciiTheme="majorHAnsi" w:cstheme="majorBidi" w:eastAsiaTheme="majorEastAsia" w:hAnsiTheme="majorHAnsi"/>
+      <w:color w:themeColor="accent1" w:val="4F81BD"/>
       <w:sz w:val="24"/>
       <w:szCs w:val="24"/>
     </w:rPr>
   </w:style>
-  <w:style w:type="paragraph" w:styleId="Heading7">
+  <w:style w:styleId="Heading7" w:type="paragraph">
     <w:name w:val="Heading 7"/>
     <w:basedOn w:val="Normal"/>
     <w:next w:val="BodyText"/>
@@ -5129,17 +5184,17 @@
     <w:pPr>
       <w:keepNext/>
       <w:keepLines/>
-      <w:spacing w:before="200" w:after="0"/>
+      <w:spacing w:after="0" w:before="200"/>
       <w:outlineLvl w:val="6"/>
     </w:pPr>
     <w:rPr>
-      <w:rFonts w:asciiTheme="majorHAnsi" w:eastAsiaTheme="majorEastAsia" w:hAnsiTheme="majorHAnsi" w:cstheme="majorBidi"/>
-      <w:color w:val="4F81BD" w:themeColor="accent1"/>
+      <w:rFonts w:asciiTheme="majorHAnsi" w:cstheme="majorBidi" w:eastAsiaTheme="majorEastAsia" w:hAnsiTheme="majorHAnsi"/>
+      <w:color w:themeColor="accent1" w:val="4F81BD"/>
       <w:sz w:val="24"/>
       <w:szCs w:val="24"/>
     </w:rPr>
   </w:style>
-  <w:style w:type="paragraph" w:styleId="Heading8">
+  <w:style w:styleId="Heading8" w:type="paragraph">
     <w:name w:val="Heading 8"/>
     <w:basedOn w:val="Normal"/>
     <w:next w:val="BodyText"/>
@@ -5149,17 +5204,17 @@
     <w:pPr>
       <w:keepNext/>
       <w:keepLines/>
-      <w:spacing w:before="200" w:after="0"/>
+      <w:spacing w:after="0" w:before="200"/>
       <w:outlineLvl w:val="7"/>
     </w:pPr>
     <w:rPr>
-      <w:rFonts w:asciiTheme="majorHAnsi" w:eastAsiaTheme="majorEastAsia" w:hAnsiTheme="majorHAnsi" w:cstheme="majorBidi"/>
-      <w:color w:val="4F81BD" w:themeColor="accent1"/>
+      <w:rFonts w:asciiTheme="majorHAnsi" w:cstheme="majorBidi" w:eastAsiaTheme="majorEastAsia" w:hAnsiTheme="majorHAnsi"/>
+      <w:color w:themeColor="accent1" w:val="4F81BD"/>
       <w:sz w:val="24"/>
       <w:szCs w:val="24"/>
     </w:rPr>
   </w:style>
-  <w:style w:type="paragraph" w:styleId="Heading9">
+  <w:style w:styleId="Heading9" w:type="paragraph">
     <w:name w:val="Heading 9"/>
     <w:basedOn w:val="Normal"/>
     <w:next w:val="BodyText"/>
@@ -5169,17 +5224,17 @@
     <w:pPr>
       <w:keepNext/>
       <w:keepLines/>
-      <w:spacing w:before="200" w:after="0"/>
+      <w:spacing w:after="0" w:before="200"/>
       <w:outlineLvl w:val="8"/>
     </w:pPr>
     <w:rPr>
-      <w:rFonts w:asciiTheme="majorHAnsi" w:eastAsiaTheme="majorEastAsia" w:hAnsiTheme="majorHAnsi" w:cstheme="majorBidi"/>
-      <w:color w:val="4F81BD" w:themeColor="accent1"/>
+      <w:rFonts w:asciiTheme="majorHAnsi" w:cstheme="majorBidi" w:eastAsiaTheme="majorEastAsia" w:hAnsiTheme="majorHAnsi"/>
+      <w:color w:themeColor="accent1" w:val="4F81BD"/>
       <w:sz w:val="24"/>
       <w:szCs w:val="24"/>
     </w:rPr>
   </w:style>
-  <w:style w:type="paragraph" w:styleId="BlockText">
+  <w:style w:styleId="BlockText" w:type="paragraph">
     <w:name w:val="Block Text"/>
     <w:basedOn w:val="BodyText"/>
     <w:next w:val="BodyText"/>
@@ -5187,17 +5242,11 @@
     <w:unhideWhenUsed/>
     <w:qFormat/>
     <w:pPr>
-      <w:spacing w:before="100" w:after="100"/>
-      <w:ind w:firstLine="0"/>
+      <w:spacing w:after="100" w:before="100"/>
+      <w:ind w:firstLine="0" w:left="480" w:right="480"/>
     </w:pPr>
-    <w:rPr>
-      <w:rFonts w:asciiTheme="majorHAnsi" w:eastAsiaTheme="majorEastAsia" w:hAnsiTheme="majorHAnsi" w:cstheme="majorBidi"/>
-      <w:bCs/>
-      <w:sz w:val="20"/>
-      <w:szCs w:val="20"/>
-    </w:rPr>
-  </w:style>
-  <w:style w:type="paragraph" w:styleId="FootnoteText">
+  </w:style>
+  <w:style w:styleId="FootnoteText" w:type="paragraph">
     <w:name w:val="Footnote Text"/>
     <w:basedOn w:val="Normal"/>
     <w:next w:val="FootnoteText"/>
@@ -5205,28 +5254,43 @@
     <w:unhideWhenUsed/>
     <w:qFormat/>
   </w:style>
-  <w:style w:type="character" w:default="1" w:styleId="DefaultParagraphFont">
+  <w:style w:default="1" w:styleId="DefaultParagraphFont" w:type="character">
     <w:name w:val="Default Paragraph Font"/>
     <w:semiHidden/>
     <w:unhideWhenUsed/>
   </w:style>
-  <w:style w:type="table" w:default="1" w:styleId="Table">
+  <w:style w:default="1" w:styleId="Table" w:type="table">
     <w:name w:val="Table"/>
     <w:basedOn w:val="TableNormal"/>
     <w:semiHidden/>
     <w:unhideWhenUsed/>
     <w:qFormat/>
     <w:tblPr>
-      <w:tblInd w:w="0" w:type="dxa"/>
+      <w:tblInd w:type="dxa" w:w="0"/>
       <w:tblCellMar>
-        <w:top w:w="0" w:type="dxa"/>
-        <w:left w:w="108" w:type="dxa"/>
-        <w:bottom w:w="0" w:type="dxa"/>
-        <w:right w:w="108" w:type="dxa"/>
+        <w:top w:type="dxa" w:w="0"/>
+        <w:left w:type="dxa" w:w="108"/>
+        <w:bottom w:type="dxa" w:w="0"/>
+        <w:right w:type="dxa" w:w="108"/>
       </w:tblCellMar>
     </w:tblPr>
-  </w:style>
-  <w:style w:type="paragraph" w:customStyle="1" w:styleId="DefinitionTerm">
+    <w:tblStylePr w:type="firstRow">
+      <w:tblPr>
+        <w:jc w:val="left"/>
+        <w:tblInd w:type="dxa" w:w="0"/>
+      </w:tblPr>
+      <w:trPr>
+        <w:jc w:val="left"/>
+      </w:trPr>
+      <w:tcPr>
+        <w:vAlign w:val="bottom"/>
+        <w:tcBorders>
+          <w:bottom w:val="single"/>
+        </w:tcBorders>
+      </w:tcPr>
+    </w:tblStylePr>
+  </w:style>
+  <w:style w:customStyle="1" w:styleId="DefinitionTerm" w:type="paragraph">
     <w:name w:val="Definition Term"/>
     <w:basedOn w:val="Normal"/>
     <w:next w:val="Definition"/>
@@ -5239,49 +5303,49 @@
       <w:b/>
     </w:rPr>
   </w:style>
-  <w:style w:type="paragraph" w:customStyle="1" w:styleId="Definition">
+  <w:style w:customStyle="1" w:styleId="Definition" w:type="paragraph">
     <w:name w:val="Definition"/>
     <w:basedOn w:val="Normal"/>
   </w:style>
-  <w:style w:type="paragraph" w:styleId="Caption">
+  <w:style w:styleId="Caption" w:type="paragraph">
     <w:name w:val="Caption"/>
     <w:basedOn w:val="Normal"/>
     <w:link w:val="BodyTextChar"/>
     <w:pPr>
-      <w:spacing w:before="0" w:after="120"/>
+      <w:spacing w:after="120" w:before="0"/>
     </w:pPr>
     <w:rPr>
       <w:i/>
     </w:rPr>
   </w:style>
-  <w:style w:type="paragraph" w:customStyle="1" w:styleId="TableCaption">
+  <w:style w:customStyle="1" w:styleId="TableCaption" w:type="paragraph">
     <w:name w:val="Table Caption"/>
     <w:basedOn w:val="Caption"/>
     <w:pPr>
       <w:keepNext/>
     </w:pPr>
   </w:style>
-  <w:style w:type="paragraph" w:customStyle="1" w:styleId="ImageCaption">
+  <w:style w:customStyle="1" w:styleId="ImageCaption" w:type="paragraph">
     <w:name w:val="Image Caption"/>
     <w:basedOn w:val="Caption"/>
   </w:style>
-  <w:style w:type="paragraph" w:customStyle="1" w:styleId="Figure">
+  <w:style w:customStyle="1" w:styleId="Figure" w:type="paragraph">
     <w:name w:val="Figure"/>
     <w:basedOn w:val="Normal"/>
   </w:style>
-  <w:style w:type="paragraph" w:customStyle="1" w:styleId="CaptionedFigure">
+  <w:style w:customStyle="1" w:styleId="CaptionedFigure" w:type="paragraph">
     <w:name w:val="Captioned Figure"/>
     <w:basedOn w:val="Figure"/>
     <w:pPr>
       <w:keepNext/>
     </w:pPr>
   </w:style>
-  <w:style w:type="character" w:customStyle="1" w:styleId="BodyTextChar">
+  <w:style w:customStyle="1" w:styleId="BodyTextChar" w:type="character">
     <w:name w:val="Body Text Char"/>
     <w:basedOn w:val="DefaultParagraphFont"/>
     <w:link w:val="BodyText"/>
   </w:style>
-  <w:style w:type="character" w:customStyle="1" w:styleId="VerbatimChar">
+  <w:style w:customStyle="1" w:styleId="VerbatimChar" w:type="character">
     <w:name w:val="Verbatim Char"/>
     <w:basedOn w:val="BodyTextChar"/>
     <w:rPr>
@@ -5289,21 +5353,25 @@
       <w:sz w:val="22"/>
     </w:rPr>
   </w:style>
-  <w:style w:type="character" w:styleId="FootnoteReference">
+  <w:style w:customStyle="1" w:styleId="SectionNumber" w:type="character">
+    <w:name w:val="Section Number"/>
+    <w:basedOn w:val="BodyTextChar"/>
+  </w:style>
+  <w:style w:styleId="FootnoteReference" w:type="character">
     <w:name w:val="Footnote Reference"/>
     <w:basedOn w:val="BodyTextChar"/>
     <w:rPr>
       <w:vertAlign w:val="superscript"/>
     </w:rPr>
   </w:style>
-  <w:style w:type="character" w:styleId="Hyperlink">
+  <w:style w:styleId="Hyperlink" w:type="character">
     <w:name w:val="Hyperlink"/>
     <w:basedOn w:val="BodyTextChar"/>
     <w:rPr>
-      <w:color w:val="4F81BD" w:themeColor="accent1"/>
+      <w:color w:themeColor="accent1" w:val="4F81BD"/>
     </w:rPr>
   </w:style>
-  <w:style w:type="paragraph" w:styleId="TOCHeading">
+  <w:style w:styleId="TOCHeading" w:type="paragraph">
     <w:name w:val="TOC Heading"/>
     <w:basedOn w:val="Heading1"/>
     <w:next w:val="BodyText"/>
@@ -5315,10 +5383,10 @@
       <w:outlineLvl w:val="9"/>
     </w:pPr>
     <w:rPr>
-      <w:rFonts w:asciiTheme="majorHAnsi" w:eastAsiaTheme="majorEastAsia" w:hAnsiTheme="majorHAnsi" w:cstheme="majorBidi"/>
+      <w:rFonts w:asciiTheme="majorHAnsi" w:cstheme="majorBidi" w:eastAsiaTheme="majorEastAsia" w:hAnsiTheme="majorHAnsi"/>
       <w:b w:val="0"/>
       <w:bCs w:val="0"/>
-      <w:color w:val="365F91" w:themeColor="accent1" w:themeShade="BF"/>
+      <w:color w:themeColor="accent1" w:themeShade="BF" w:val="365F91"/>
     </w:rPr>
   </w:style>
   <w:style w:type="paragraph" w:customStyle="1" w:styleId="SourceCode">
@@ -5410,7 +5478,10 @@
   <w:style w:type="character" w:customStyle="1" w:styleId="ImportTok">
     <w:name w:val="ImportTok"/>
     <w:basedOn w:val="VerbatimChar"/>
-    <w:rPr/>
+    <w:rPr>
+      <w:color w:val="008000"/>
+      <w:b/>
+    </w:rPr>
   </w:style>
   <w:style w:type="character" w:customStyle="1" w:styleId="CommentTok">
     <w:name w:val="CommentTok"/>
@@ -5485,7 +5556,9 @@
   <w:style w:type="character" w:customStyle="1" w:styleId="BuiltInTok">
     <w:name w:val="BuiltInTok"/>
     <w:basedOn w:val="VerbatimChar"/>
-    <w:rPr/>
+    <w:rPr>
+      <w:color w:val="008000"/>
+    </w:rPr>
   </w:style>
   <w:style w:type="character" w:customStyle="1" w:styleId="ExtensionTok">
     <w:name w:val="ExtensionTok"/>

</xml_diff>